<commit_message>
Restyle result figures after author's OSF scripts, add Figure 1 stills, video-norming covariate setup, appendix table, Table 1 wording note
Co-Authored-By: Claude Opus 5.5 <noreply@anthropic.com>
Claude-Session: https://claude.ai/code/session_01Q96WePso3R7jviE8KBARip
</commit_message>
<xml_diff>
--- a/drafts/Manuscript_R15_full_draft.docx
+++ b/drafts/Manuscript_R15_full_draft.docx
@@ -2604,8 +2604,7 @@
               <w:keepNext/>
             </w:pPr>
             <w:r>
-              <w:lastRenderedPageBreak/>
-              <w:t>4</w:t>
+              <w:t>4ᵉ</w:t>
             </w:r>
           </w:p>
         </w:tc>
@@ -4153,7 +4152,7 @@
               <w:keepNext/>
             </w:pPr>
             <w:r>
-              <w:t>10</w:t>
+              <w:t>10ᵉ</w:t>
             </w:r>
           </w:p>
         </w:tc>
@@ -4428,864 +4427,97 @@
       </w:r>
       <w:r>
         <w:rPr/>
-        <w:t xml:space="preserve"> “pull-open throat,” “raise one’s voice.” </w:t>
+        <w:t xml:space="preserve"> “pull-open throat,” “raise one’s voice.” ᵉ The rating items for this pair used </w:t>
+      </w:r>
+      <w:r>
+        <w:rPr>
+          <w:i/>
+        </w:rPr>
+        <w:t xml:space="preserve">zhuài</w:t>
+      </w:r>
+      <w:r>
+        <w:rPr/>
+        <w:t xml:space="preserve"> “drag” instead of </w:t>
+      </w:r>
+      <w:r>
+        <w:rPr>
+          <w:i/>
+        </w:rPr>
+        <w:t xml:space="preserve">chě</w:t>
+      </w:r>
+      <w:r>
+        <w:rPr/>
+        <w:t xml:space="preserve"> and the target result </w:t>
+      </w:r>
+      <w:r>
+        <w:rPr>
+          <w:i/>
+        </w:rPr>
+        <w:t xml:space="preserve">pò</w:t>
+      </w:r>
+      <w:r>
+        <w:rPr/>
+        <w:t xml:space="preserve"> “torn” (Pair 4) or </w:t>
+      </w:r>
+      <w:r>
+        <w:rPr>
+          <w:i/>
+        </w:rPr>
+        <w:t xml:space="preserve">suì</w:t>
+      </w:r>
+      <w:r>
+        <w:rPr/>
+        <w:t xml:space="preserve"> “smashed” (Pair 10) instead of </w:t>
+      </w:r>
+      <w:r>
+        <w:rPr>
+          <w:i/>
+        </w:rPr>
+        <w:t xml:space="preserve">kāi</w:t>
+      </w:r>
+      <w:r>
+        <w:rPr/>
+        <w:t xml:space="preserve"> “open.”</w:t>
+      </w:r>
+    </w:p>
+    <w:p>
+      <w:pPr>
+        <w:rPr>
+          <w:rFonts w:eastAsiaTheme="minorEastAsia"/>
+        </w:rPr>
+      </w:pPr>
+      <w:r>
+        <w:t xml:space="preserve">Each of the 20 actions was filmed in a full-result and a zero-result version, yielding 40 critical videos (5.0–25.0 s, </w:t>
+      </w:r>
+      <w:r>
+        <w:rPr>
+          <w:i/>
+        </w:rPr>
+        <w:t>M</w:t>
+      </w:r>
+      <w:r>
+        <w:t xml:space="preserve"> = 11.4 s). In the full-result version, the action brings about the target result (e.g., the lychee is peeled open); in the zero-result version, the actor performs the same action, but the object is left perceptibly unchanged (e.g., the lychee remains closed). The two versions differ only in this outcome. Each video began and ended with the actor still for 1 s. Eight filler videos showed actions without an affected object (e.g., squatting, shaking one’s head).</w:t>
+      </w:r>
+      <w:r>
+        <w:rPr/>
+        <w:t xml:space="preserve"> Figure 1 shows stills from the four videos of one pair.</w:t>
       </w:r>
       <w:r>
         <w:rPr>
           <w:highlight w:val="yellow"/>
         </w:rPr>
-        <w:t xml:space="preserve">[待核对：评定问卷中 Pair 4 为 zhuài “pull”、目标结果 pò “torn”，Pair 10 的目标结果为 suì “broken”；实验中使用的是 chě、sī-kāi/chě-kāi 和 jiā-kāi/chuí-kāi。表中评定数值仍为原评定结果，V1、RVC 和 CCL 列已改为实验用词。]</w:t>
-      </w:r>
-    </w:p>
-    <w:p>
-      <w:pPr>
-        <w:rPr>
-          <w:rFonts w:eastAsiaTheme="minorEastAsia"/>
-        </w:rPr>
-      </w:pPr>
-      <w:r>
-        <w:t xml:space="preserve">Each of the 20 actions was filmed in a full-result and a zero-result version, yielding 40 critical videos (5.0–25.0 s, </w:t>
-      </w:r>
-      <w:r>
-        <w:rPr>
-          <w:i/>
-        </w:rPr>
-        <w:t>M</w:t>
-      </w:r>
-      <w:r>
-        <w:t xml:space="preserve"> = 11.4 s). In the full-result version, the action brings about the target result (e.g., the lychee is peeled open); in the zero-result version, the actor performs the same action, but the object is left perceptibly unchanged (e.g., the lychee remains closed). The two versions differ only in this outcome. Each video began and ended with the actor still for 1 s. Eight filler videos showed actions without an affected object (e.g., squatting, shaking one’s head). </w:t>
-      </w:r>
+      </w:r>
+      <w:proofErr w:type="spellStart"/>
       <w:r>
         <w:rPr>
           <w:highlight w:val="yellow"/>
         </w:rPr>
-        <w:t xml:space="preserve">[Figure 1：full-result 与 zero-result </w:t>
-      </w:r>
-      <w:proofErr w:type="spellStart"/>
+      </w:r>
+      <w:proofErr w:type="spellEnd"/>
       <w:r>
         <w:rPr>
           <w:highlight w:val="yellow"/>
         </w:rPr>
-        <w:t>视频的截图</w:t>
-      </w:r>
-      <w:proofErr w:type="spellEnd"/>
-      <w:r>
-        <w:rPr>
-          <w:highlight w:val="yellow"/>
-        </w:rPr>
-        <w:t>]</w:t>
-      </w:r>
-    </w:p>
-    <w:p>
-      <w:pPr>
-        <w:pStyle w:val="Heading2"/>
-      </w:pPr>
-      <w:r>
-        <w:lastRenderedPageBreak/>
-        <w:t>Verb–Video Correspondence</w:t>
-      </w:r>
-    </w:p>
-    <w:p>
-      <w:r>
-        <w:t xml:space="preserve">Because each expression was paired with its own video, the comparison between the two members of a pair is also a comparison between two videos. A norming study therefore assessed whether each video elicited the intended V1. Sixteen adults (20–24 years, </w:t>
-      </w:r>
-      <w:r>
-        <w:rPr>
-          <w:i/>
-        </w:rPr>
-        <w:t>M</w:t>
-      </w:r>
-      <w:r>
-        <w:t xml:space="preserve"> = 22.4; 13 female) watched the 20 zero-result videos with the final 30% removed, so that their descriptions would focus on the action rather than the outcome. Each participant saw either the 10 videos of the stronger-association actions or the 10 videos of the weaker-association actions and described each in a full sentence. If the intended V1 did not appear, the participant was asked for another description; if it still did not appear after two attempts, the participant rated how natural the intended V1 was as a description of the action (1 = </w:t>
-      </w:r>
-      <w:r>
-        <w:rPr>
-          <w:i/>
-        </w:rPr>
-        <w:t>very unnatural</w:t>
-      </w:r>
-      <w:r>
-        <w:t xml:space="preserve">, 5 = </w:t>
-      </w:r>
-      <w:r>
-        <w:rPr>
-          <w:i/>
-        </w:rPr>
-        <w:t>very natural</w:t>
-      </w:r>
-      <w:r>
-        <w:t>). The intended V1 appeared in 62% of first descriptions and in 72% of all descriptions; when it did not appear, it was rated as natural (</w:t>
-      </w:r>
-      <w:r>
-        <w:rPr>
-          <w:i/>
-        </w:rPr>
-        <w:t>M</w:t>
-      </w:r>
-      <w:r>
-        <w:t xml:space="preserve"> = 4.32, </w:t>
-      </w:r>
-      <w:r>
-        <w:rPr>
-          <w:i/>
-        </w:rPr>
-        <w:t>SD</w:t>
-      </w:r>
-      <w:r>
-        <w:t xml:space="preserve"> = 0.79, range = 2.67–5). </w:t>
-      </w:r>
-      <w:r>
-        <w:rPr>
-          <w:highlight w:val="yellow"/>
-        </w:rPr>
-        <w:t>[逐项数值放附录]</w:t>
-      </w:r>
-      <w:r>
-        <w:t xml:space="preserve"> </w:t>
-      </w:r>
-      <w:r>
-        <w:rPr/>
-        <w:t xml:space="preserve">These item-level values are to be used as a covariate in a sensitivity analysis of Experiment 1. </w:t>
-      </w:r>
-      <w:r>
-        <w:rPr>
-          <w:highlight w:val="yellow"/>
-        </w:rPr>
-        <w:t xml:space="preserve">[逐项数值到位后补做该协变量分析]</w:t>
-      </w:r>
-    </w:p>
-    <w:p>
-      <w:pPr>
-        <w:pStyle w:val="Heading2"/>
-      </w:pPr>
-      <w:r>
-        <w:t>Adult Ratings of Result Likelihood and Action Typicality</w:t>
-      </w:r>
-    </w:p>
-    <w:p>
-      <w:pPr>
-        <w:rPr>
-          <w:rFonts w:eastAsiaTheme="minorEastAsia"/>
-        </w:rPr>
-      </w:pPr>
-      <w:r>
-        <w:t xml:space="preserve">Twenty native speakers of Mandarin (21–35 years, </w:t>
-      </w:r>
-      <w:r>
-        <w:rPr>
-          <w:i/>
-        </w:rPr>
-        <w:t>M</w:t>
-      </w:r>
-      <w:r>
-        <w:t xml:space="preserve"> = 28.2) </w:t>
-      </w:r>
-      <w:r>
-        <w:rPr>
-          <w:highlight w:val="yellow"/>
-        </w:rPr>
-      </w:r>
-      <w:r>
-        <w:rPr/>
-        <w:t xml:space="preserve">(9 female)</w:t>
-      </w:r>
-      <w:r>
-        <w:t xml:space="preserve"> completed an online questionnaire of about 5 min, in which they rated each of the 20 V1–object expressions in two separate blocks. After a consent statement and questions about their language background (native language, frequency of Mandarin use, and English proficiency), they were told that the questions had no correct answers and were asked to respond on the basis of their everyday experience and first intuition. In the likelihood block, each item presented a perfective sentence containing the V1–object expression, followed by a question about the target result, for example, </w:t>
-      </w:r>
-      <w:r>
-        <w:rPr>
-          <w:i/>
-        </w:rPr>
-        <w:t>Xiǎo Lǐ sī-le zhǐ</w:t>
-      </w:r>
-      <w:r>
-        <w:t xml:space="preserve"> “Xiao Li tore the paper. How likely do you think it is that the paper ended up torn?” The instructions asked participants to judge, on the basis of the sentence and their everyday experience, how likely it was that the stated result eventually occurred. They </w:t>
-      </w:r>
-      <w:r>
-        <w:lastRenderedPageBreak/>
-        <w:t xml:space="preserve">typed a number from 0 to 100, where 0 was labeled </w:t>
-      </w:r>
-      <w:r>
-        <w:rPr>
-          <w:i/>
-        </w:rPr>
-        <w:t>cannot happen</w:t>
-      </w:r>
-      <w:r>
-        <w:t xml:space="preserve"> and 100 </w:t>
-      </w:r>
-      <w:r>
-        <w:rPr>
-          <w:i/>
-        </w:rPr>
-        <w:t>will certainly happen</w:t>
-      </w:r>
-      <w:r>
-        <w:t xml:space="preserve">. In the typicality block, the instructions stated that each item first named a result that someone wanted to achieve and then an action that could be used to achieve it, and asked participants to rate how typical the action was as a way of achieving that result, for example, “Suppose Xiao Li wants to break the walnut. How typical is </w:t>
-      </w:r>
-      <w:r>
-        <w:rPr>
-          <w:i/>
-        </w:rPr>
-        <w:t>jiā hétao</w:t>
-      </w:r>
-      <w:r>
-        <w:t xml:space="preserve"> ‘clamping the walnut’ as a way of doing this?” Responses were given on a 7-point scale whose endpoints were labeled 1 (</w:t>
-      </w:r>
-      <w:r>
-        <w:rPr>
-          <w:i/>
-        </w:rPr>
-        <w:t>very atypical</w:t>
-      </w:r>
-      <w:r>
-        <w:t>) and 7 (</w:t>
-      </w:r>
-      <w:r>
-        <w:rPr>
-          <w:i/>
-        </w:rPr>
-        <w:t>very typical</w:t>
-      </w:r>
-      <w:r>
-        <w:t>); the intermediate points were numbered but not labeled. The likelihood items thus presented each expression in the same perfective form as the V1 questions of Experiment 1. Because the ratings were collected for sentences naming the expressions, they characterize the action–result relation that each expression describes, not the particular videos.</w:t>
-      </w:r>
-    </w:p>
-    <w:p>
-      <w:pPr>
-        <w:rPr>
-          <w:rFonts w:eastAsiaTheme="minorEastAsia"/>
-        </w:rPr>
-      </w:pPr>
-      <w:r>
-        <w:t>Four lists were constructed, and five raters completed each list. In all lists, the 20 likelihood items preceded the 20 typicality items. Within each block, the 10 stronger-association expressions and the 10 weaker-association expressions were presented in separate halves, with the pairs in the same order in both halves, so that the two members of each pair were always separated by nine other items. The stronger-association expressions came first in Lists 1 and 3, and the weaker-association expressions came first in Lists 2 and 4. Four different pair orders were used, two for Lists 1 and 2 and two for Lists 3 and 4, and the two blocks of each list used different orders. Because the likelihood block always came first, the typicality judgments may have been influenced by the preceding likelihood judgments. All raters completed all items, and no ratings were excluded. The ratings were collected after the child data had been collected and initially analyzed with the original Strong/Weak coding; the raters did not take part in the child experiments and received no information about children’s responses.</w:t>
-      </w:r>
-    </w:p>
-    <w:p>
-      <w:r>
-        <w:lastRenderedPageBreak/>
-        <w:t xml:space="preserve">For each rater and pair, we computed the difference between the ratings of the two expressions (expected stronger- minus expected weaker-association expression) and modeled these differences with crossed random intercepts for raters and pairs, estimated by restricted maximum likelihood. Because there were only 10 pairs, we report 95% confidence intervals from a bootstrap that resampled both raters and pairs, and exact </w:t>
-      </w:r>
-      <w:r>
-        <w:rPr>
-          <w:i/>
-        </w:rPr>
-        <w:t>p</w:t>
-      </w:r>
-      <w:r>
-        <w:t xml:space="preserve"> values from a randomization test that exchanged the two expression labels within pairs across all 2¹⁰ assignments. Across the 10 pairs, the expected stronger-association expressions received higher likelihood ratings (mean difference = 33.06 points, 95% CI [21.74, 44.70], </w:t>
-      </w:r>
-      <w:r>
-        <w:rPr>
-          <w:i/>
-        </w:rPr>
-        <w:t>p</w:t>
-      </w:r>
-      <w:r>
-        <w:t xml:space="preserve"> = .003) and higher typicality ratings (mean difference = 2.45 points, 95% CI [1.25, 3.59], </w:t>
-      </w:r>
-      <w:r>
-        <w:rPr>
-          <w:i/>
-        </w:rPr>
-        <w:t>p</w:t>
-      </w:r>
-      <w:r>
-        <w:t xml:space="preserve"> = .007). The pair-level differences in the two ratings were correlated, </w:t>
-      </w:r>
-      <w:r>
-        <w:rPr>
-          <w:i/>
-        </w:rPr>
-        <w:t>r</w:t>
-      </w:r>
-      <w:r>
-        <w:t xml:space="preserve"> = .79, permutation </w:t>
-      </w:r>
-      <w:r>
-        <w:rPr>
-          <w:i/>
-        </w:rPr>
-        <w:t>p</w:t>
-      </w:r>
-      <w:r>
-        <w:t xml:space="preserve"> = .005. Mean ratings for each expression are shown in Table 1.</w:t>
-      </w:r>
-    </w:p>
-    <w:p>
-      <w:pPr>
-        <w:pStyle w:val="Heading2"/>
-      </w:pPr>
-      <w:r>
-        <w:t>Pair Selection</w:t>
-      </w:r>
-    </w:p>
-    <w:p>
-      <w:r>
-        <w:t>A pair was retained for the analyses of Experiment 1 if the expected stronger-association expression received reliably higher ratings than its partner on both scales, as assessed by a within-rater label-exchange test for each pair (</w:t>
-      </w:r>
-      <w:r>
-        <w:rPr>
-          <w:i/>
-        </w:rPr>
-        <w:t>p</w:t>
-      </w:r>
-      <w:r>
-        <w:t xml:space="preserve"> &lt; .05, uncorrected). Eight pairs met this criterion. Two did not. In Pair 7 (</w:t>
-      </w:r>
-      <w:r>
-        <w:rPr>
-          <w:i/>
-        </w:rPr>
-        <w:t>qiā</w:t>
-      </w:r>
-      <w:r>
-        <w:t xml:space="preserve"> “pinch” vs. </w:t>
-      </w:r>
-      <w:r>
-        <w:rPr>
-          <w:i/>
-        </w:rPr>
-        <w:t>jiào</w:t>
-      </w:r>
-      <w:r>
-        <w:t xml:space="preserve"> “call” a person, with the target result </w:t>
-      </w:r>
-      <w:r>
-        <w:rPr>
-          <w:i/>
-        </w:rPr>
-        <w:t>xǐng</w:t>
-      </w:r>
-      <w:r>
-        <w:t xml:space="preserve"> “awake”), the likelihood difference was in the expected direction, but the typicality difference was reversed (−1.00 points, 95% CI [−1.70, −0.30]). In Pair 8 (</w:t>
-      </w:r>
-      <w:r>
-        <w:rPr>
-          <w:i/>
-        </w:rPr>
-        <w:t>tú</w:t>
-      </w:r>
-      <w:r>
-        <w:t xml:space="preserve"> “paint” vs. </w:t>
-      </w:r>
-      <w:r>
-        <w:rPr>
-          <w:i/>
-        </w:rPr>
-        <w:t>náo</w:t>
-      </w:r>
-      <w:r>
-        <w:t xml:space="preserve"> “scratch” a palm, with the target result </w:t>
-      </w:r>
-      <w:r>
-        <w:rPr>
-          <w:i/>
-        </w:rPr>
-        <w:t>hóng</w:t>
-      </w:r>
-      <w:r>
-        <w:t xml:space="preserve"> “red”), neither difference was reliable (likelihood: 16.40 points, 95% CI [−1.00, 33.40]; typicality: 0.45 points, 95% CI [−0.90, 1.85]). Because action–result association is defined by the two ratings jointly, the actions in these pairs cannot be classified as stronger- or weaker-association actions. The two pairs remained in the experimental lists, so all participants saw all 10 pairs, but their trials are excluded from the analyses of Experiment 1. The original design included all </w:t>
-      </w:r>
-      <w:r>
-        <w:lastRenderedPageBreak/>
-        <w:t>10 pairs, and an initial analysis of the child data used all of them with the original Strong/Weak coding. The adult ratings were collected, and Pairs 7 and 8 excluded, after that analysis. The exclusion criterion refers only to the rating data, not to children’s responses, but because both steps followed an inspection of the child data, analyses with all 10 pairs are reported alongside the main analyses of Experiment 1 (see Sensitivity Analyses).</w:t>
-      </w:r>
-    </w:p>
-    <w:p>
-      <w:r>
-        <w:t>In the eight retained pairs, the stronger-association expressions had a mean likelihood rating of 80.08 and a mean typicality rating of 6.34, compared with 42.59 and 3.21 for their weaker-association partners. Within pairs, the likelihood difference ranged from 28.90 to 67.90 points and the typicality difference from 1.30 to 4.60 points. The pair-level tests used for selection are exploratory and uncorrected for multiple comparisons. They identify pairs in which the two ratings agree; they do not establish lexical classes of V1s.</w:t>
-      </w:r>
-    </w:p>
-    <w:p>
-      <w:pPr>
-        <w:pStyle w:val="Heading2"/>
-      </w:pPr>
-      <w:r>
-        <w:t>Corpus Frequency of the Corresponding RVCs</w:t>
-      </w:r>
-    </w:p>
-    <w:p>
-      <w:r>
-        <w:t xml:space="preserve">We also examined how conventional each RVC is. As noted in the Introduction, whether a V1 and a V2 combine depends on how the action named by V1 relates to the result named by V2. If the two actions in a pair differ in their association with the target result, this difference should also be reflected in the language, such that the RVC formed with the stronger-association V1 is the more conventional one. Corpus frequency thus provides a check on the contrast between the paired V1s that does not rely on the adult ratings, although conventionality concerns the RVC as an expression rather than the action–result relation itself. We therefore searched the modern Chinese section of the CCL corpus (Zhan et al., 2019) for each of the 20 RVCs. The corpus reports the number of documents in which a string occurs rather than the number of tokens, and string matching also returns sequences in which the two characters belong to different words (e.g., </w:t>
-      </w:r>
-      <w:r>
-        <w:rPr>
-          <w:i/>
-        </w:rPr>
-        <w:t>zhǐhuī | mièhuǒ</w:t>
-      </w:r>
-      <w:r>
-        <w:t xml:space="preserve"> “command | fire-fighting” for </w:t>
-      </w:r>
-      <w:r>
-        <w:rPr>
-          <w:i/>
-        </w:rPr>
-        <w:t>huī-miè</w:t>
-      </w:r>
-      <w:r>
-        <w:t xml:space="preserve">). All matches for the </w:t>
-      </w:r>
-      <w:r>
-        <w:lastRenderedPageBreak/>
-        <w:t xml:space="preserve">less frequent RVCs were therefore checked by hand. For the more frequent RVCs, matches were segmented automatically to check for word boundaries before V1 and after V2, and 10–12 matches per RVC were checked by hand; for </w:t>
-      </w:r>
-      <w:r>
-        <w:rPr>
-          <w:i/>
-        </w:rPr>
-        <w:t>tú-hóng</w:t>
-      </w:r>
-      <w:r>
-        <w:t xml:space="preserve"> “paint-red,” a sample of 60 matches was checked. Figurative and idiomatic uses </w:t>
-      </w:r>
-      <w:r>
-        <w:rPr/>
-        <w:t xml:space="preserve">(e.g., </w:t>
-      </w:r>
-      <w:r>
-        <w:rPr>
-          <w:i/>
-        </w:rPr>
-        <w:t xml:space="preserve">chě-kāi sǎngzi</w:t>
-      </w:r>
-      <w:r>
-        <w:rPr/>
-        <w:t xml:space="preserve"> “pull-open throat,” “raise one’s voice”)</w:t>
-      </w:r>
-      <w:r>
-        <w:rPr>
-          <w:i/>
-        </w:rPr>
-      </w:r>
-      <w:r>
-        <w:t xml:space="preserve"> were counted, because they also indicate that the combination is conventional. For the RVCs checked by sampling, the number of documents was estimated by multiplying the raw document count by the proportion of checked matches that were resultative uses; for the other RVCs, all matches were checked. Document counts are shown in Table 1.</w:t>
-      </w:r>
-    </w:p>
-    <w:p>
-      <w:r>
-        <w:t xml:space="preserve">In seven of the eight retained pairs, the RVC formed with the stronger-association V1 occurred in more documents than the RVC formed with its weaker-association partner, in most pairs by more than an order of magnitude. The exception was Pair 6, in which </w:t>
-      </w:r>
-      <w:r>
-        <w:rPr>
-          <w:i/>
-        </w:rPr>
-        <w:t>tuī-dǎo</w:t>
-      </w:r>
-      <w:r>
-        <w:t xml:space="preserve"> “push-fallen” (5,750 documents) was far more frequent than </w:t>
-      </w:r>
-      <w:r>
-        <w:rPr>
-          <w:i/>
-        </w:rPr>
-        <w:t>tī-dǎo</w:t>
-      </w:r>
-      <w:r>
-        <w:t xml:space="preserve"> “kick-fallen” (480), largely because of abstract uses such as </w:t>
-      </w:r>
-      <w:r>
-        <w:rPr>
-          <w:i/>
-        </w:rPr>
-        <w:t>tuīdǎo chónglái</w:t>
-      </w:r>
-      <w:r>
-        <w:t xml:space="preserve"> “tear down and start over.” The pattern does not reflect the frequency of the V1s themselves: As single words, several weaker-association V1s (e.g., </w:t>
-      </w:r>
-      <w:r>
-        <w:rPr>
-          <w:i/>
-        </w:rPr>
-        <w:t>pāi</w:t>
-      </w:r>
-      <w:r>
-        <w:t xml:space="preserve"> “slap,” </w:t>
-      </w:r>
-      <w:r>
-        <w:rPr>
-          <w:i/>
-        </w:rPr>
-        <w:t>àn</w:t>
-      </w:r>
-      <w:r>
-        <w:t xml:space="preserve"> “press,” </w:t>
-      </w:r>
-      <w:r>
-        <w:rPr>
-          <w:i/>
-        </w:rPr>
-        <w:t>tuī</w:t>
-      </w:r>
-      <w:r>
-        <w:t xml:space="preserve"> “push,” </w:t>
-      </w:r>
-      <w:r>
-        <w:rPr>
-          <w:i/>
-        </w:rPr>
-        <w:t>chōng</w:t>
-      </w:r>
-      <w:r>
-        <w:t xml:space="preserve"> “rinse”) are more frequent than their stronger-association partners (Speer, 2022). Most weaker-association RVCs were attested, although rarely; only </w:t>
-      </w:r>
-      <w:r>
-        <w:rPr>
-          <w:i/>
-        </w:rPr>
-        <w:t>huī-miè</w:t>
-      </w:r>
-      <w:r>
-        <w:t xml:space="preserve"> “wave-extinguished” was unattested in its resultative use. The corpus data thus indicate that the RVCs formed with stronger-association V1s are more conventional, not that those formed with weaker-association V1s are unacceptable. Because the CCL corpus consists mainly of written texts, the counts do not describe children’s input. RVC frequency is reported to characterize the materials and is not entered into the analyses.</w:t>
-      </w:r>
-    </w:p>
-    <w:p>
-      <w:pPr>
-        <w:pStyle w:val="Heading1"/>
-      </w:pPr>
-      <w:r>
-        <w:lastRenderedPageBreak/>
-        <w:t>Experiment 1: Comprehension</w:t>
-      </w:r>
-    </w:p>
-    <w:p>
-      <w:pPr>
-        <w:pStyle w:val="Heading2"/>
-      </w:pPr>
-      <w:r>
-        <w:t>Method</w:t>
-      </w:r>
-    </w:p>
-    <w:p>
-      <w:pPr>
-        <w:pStyle w:val="Heading3"/>
-      </w:pPr>
-      <w:r>
-        <w:t>Participants</w:t>
-      </w:r>
-    </w:p>
-    <w:p>
-      <w:r>
-        <w:t xml:space="preserve">Participants were 32 four-year-olds </w:t>
-      </w:r>
-      <w:r>
-        <w:rPr/>
-        <w:t xml:space="preserve">(14 female; 4;0–4;10, </w:t>
-      </w:r>
-      <w:r>
-        <w:rPr>
-          <w:i/>
-        </w:rPr>
-        <w:t xml:space="preserve">M</w:t>
-      </w:r>
-      <w:r>
-        <w:rPr/>
-        <w:t xml:space="preserve"> = 4;7)</w:t>
-      </w:r>
-      <w:r>
-        <w:rPr>
-          <w:highlight w:val="yellow"/>
-        </w:rPr>
-      </w:r>
-      <w:r>
-        <w:t xml:space="preserve">, 32 five-year-olds </w:t>
-      </w:r>
-      <w:r>
-        <w:rPr/>
-        <w:t xml:space="preserve">(15 female; 5;0–5;11, </w:t>
-      </w:r>
-      <w:r>
-        <w:rPr>
-          <w:i/>
-        </w:rPr>
-        <w:t xml:space="preserve">M</w:t>
-      </w:r>
-      <w:r>
-        <w:rPr/>
-        <w:t xml:space="preserve"> = 5;5)</w:t>
-      </w:r>
-      <w:r>
-        <w:rPr>
-          <w:highlight w:val="yellow"/>
-        </w:rPr>
-      </w:r>
-      <w:r>
-        <w:t xml:space="preserve">, and 40 adults (18 female; </w:t>
-      </w:r>
-      <w:r>
-        <w:rPr/>
-        <w:t xml:space="preserve">18;4–37;3 years, </w:t>
-      </w:r>
-      <w:r>
-        <w:rPr>
-          <w:i/>
-        </w:rPr>
-        <w:t xml:space="preserve">M</w:t>
-      </w:r>
-      <w:r>
-        <w:rPr/>
-        <w:t xml:space="preserve"> = 23.1</w:t>
-      </w:r>
-      <w:r>
-        <w:rPr>
-          <w:i/>
-        </w:rPr>
-      </w:r>
-      <w:r>
-        <w:t>). Children were recruited from two kindergartens in Hunan Province, China, and adults from a university in Beijing. All participants were native speakers of Mandarin with no reported language or intellectual impairments. Guardians and adult participants gave written informed consent under a protocol approved by the university’s institutional review board. Children received a book as a gift, and adults received 10 RMB. Sample size was set before data collection at 32 children per age group, following previous studies of Mandarin verb comprehension (Chen, 2017; J. Liu, 2018).</w:t>
-      </w:r>
-    </w:p>
-    <w:p>
-      <w:pPr>
-        <w:pStyle w:val="Heading3"/>
-      </w:pPr>
-      <w:r>
-        <w:t>Design and Materials</w:t>
-      </w:r>
-    </w:p>
-    <w:p>
-      <w:r>
-        <w:t>On each trial, participants watched one critical video and answered a perfective yes–no question about it. The question contained either the RVC or the V1, with the object as a bare noun, as in (3).</w:t>
-      </w:r>
-    </w:p>
-    <w:p>
-      <w:pPr>
-        <w:pStyle w:val="ExampleFirst"/>
-      </w:pPr>
-      <w:r>
-        <w:t>(3)</w:t>
-      </w:r>
-      <w:r>
-        <w:tab/>
-        <w:t>a.</w:t>
-      </w:r>
-      <w:r>
-        <w:tab/>
-      </w:r>
-      <w:r>
-        <w:rPr>
-          <w:i/>
-        </w:rPr>
-        <w:t>Tā bāo-le lìzhī ma?</w:t>
-      </w:r>
-    </w:p>
-    <w:p>
-      <w:pPr>
-        <w:pStyle w:val="Example"/>
-      </w:pPr>
-      <w:r>
-        <w:tab/>
-      </w:r>
-      <w:r>
-        <w:tab/>
-        <w:t>she peel-PERF lychee Q</w:t>
-      </w:r>
-    </w:p>
-    <w:p>
-      <w:pPr>
-        <w:pStyle w:val="Example"/>
-      </w:pPr>
-      <w:r>
-        <w:tab/>
-      </w:r>
-      <w:r>
-        <w:tab/>
-        <w:t>“Did she peel (the) lychee?”</w:t>
-      </w:r>
-    </w:p>
-    <w:p>
-      <w:pPr>
-        <w:pStyle w:val="Example"/>
-      </w:pPr>
-      <w:r>
-        <w:tab/>
-        <w:t>b.</w:t>
-      </w:r>
-      <w:r>
-        <w:tab/>
-      </w:r>
-      <w:r>
-        <w:rPr>
-          <w:i/>
-        </w:rPr>
-        <w:t>Tā bāo-kāi-le lìzhī ma?</w:t>
-      </w:r>
-    </w:p>
-    <w:p>
-      <w:pPr>
-        <w:pStyle w:val="Example"/>
-      </w:pPr>
-      <w:r>
-        <w:tab/>
-      </w:r>
-      <w:r>
-        <w:tab/>
-        <w:t>she peel-open-PERF lychee Q</w:t>
-      </w:r>
-    </w:p>
-    <w:p>
-      <w:pPr>
-        <w:pStyle w:val="ExampleLast"/>
-      </w:pPr>
-      <w:r>
-        <w:tab/>
-      </w:r>
-      <w:r>
-        <w:tab/>
-        <w:t>“Did she peel (the) lychee open?”</w:t>
-      </w:r>
-    </w:p>
-    <w:p>
-      <w:r>
-        <w:t>Form (RVC vs. V1) and Action–Result Association (Stronger vs. Weaker) were manipulated between participants, and Result Realization (Full vs. Zero) within participants.</w:t>
-      </w:r>
-      <w:r>
-        <w:rPr>
-          <w:rFonts w:eastAsiaTheme="minorEastAsia" w:hint="eastAsia"/>
-        </w:rPr>
-      </w:r>
-      <w:r/>
-      <w:r>
-        <w:rPr>
-          <w:rFonts w:eastAsiaTheme="minorEastAsia" w:hint="eastAsia"/>
-        </w:rPr>
-      </w:r>
-      <w:r/>
-      <w:r>
-        <w:rPr>
-          <w:rFonts w:eastAsiaTheme="minorEastAsia" w:hint="eastAsia"/>
-        </w:rPr>
-      </w:r>
-      <w:r>
-        <w:t xml:space="preserve"> Eight lists crossed four event lists with the two forms. Each event list contained one action from each of the 10 pairs, either all stronger-association or all weaker-association actions, with five videos in their full-result and five in their zero-result version; across the two event lists with the same actions,</w:t>
-      </w:r>
-      <w:r>
-        <w:t xml:space="preserve"> each video appeared once in each version. Each list also contained eight filler videos (one practice and seven test trials), whose questions either matched or did not match the depicted action, to balance “yes” and “no” answers. Participants were randomly assigned to lists. In the eight retained pairs, each participant judged eight critical trials, and across lists each retained video appeared equally often in its full-result and zero-result version.</w:t>
-      </w:r>
-    </w:p>
-    <w:p>
-      <w:r>
-        <w:t>With about four children per age group and five adults per list, the V1 descriptions of the stronger-association actions, like those of the weaker-association actions, were judged by eight children per age group and 10 adults, and each V1 description in a given result condition by about four children per age group. Comparisons between stronger- and weaker-association V1s are therefore largely between participants, and item-level estimates are imprecise.</w:t>
-      </w:r>
-    </w:p>
-    <w:p>
-      <w:pPr>
-        <w:pStyle w:val="Heading3"/>
-      </w:pPr>
-      <w:r>
-        <w:t>Procedure</w:t>
-      </w:r>
-    </w:p>
-    <w:p>
-      <w:r>
-        <w:t>Children were tested individually in a quiet room in their kindergarten. After each video, they heard the question and answered orally, and an experimenter recorded the response. If a child reported not having seen the video clearly or did not answer, the video was played once more. Adults were tested online in Gorilla (Anwyl-Irvine et al., 2020); they received oral instructions from an experimenter and selected their answers themselves. Each session began with one practice trial. Acceptance was coded 1 and rejection 0.</w:t>
-      </w:r>
-    </w:p>
-    <w:p>
-      <w:pPr>
-        <w:pStyle w:val="Heading2"/>
-      </w:pPr>
-      <w:r>
-        <w:t>Analysis Plan</w:t>
-      </w:r>
-    </w:p>
-    <w:p>
-      <w:r>
-        <w:t xml:space="preserve">Trial-level acceptance is modeled with Bayesian logistic mixed-effects models in brms (Bürkner, 2017) in R (R Core Team, 2024). Bayesian estimation was chosen because near-ceiling acceptance in full-result events and in some adult conditions produces quasi-separation, and frequentist models with the required interaction structure did not converge on these data. Factors are sum-coded. Fixed effects have Normal(0, 1.5) priors, standard deviations </w:t>
-      </w:r>
-      <w:r>
-        <w:lastRenderedPageBreak/>
-        <w:t xml:space="preserve">Exponential(1) priors, and correlations LKJ(2) priors. Convergence is assessed by </w:t>
-      </w:r>
-      <w:r>
-        <w:rPr>
-          <w:i/>
-        </w:rPr>
-        <w:t>R̂</w:t>
-      </w:r>
-      <w:r>
-        <w:t xml:space="preserve"> &lt; 1.01 and adequate effective sample sizes. We report posterior medians, 95% credible intervals, and predicted acceptance probabilities, and, for directional predictions, the posterior probability that the effect has the predicted sign. Because precision in designs with few stimuli depends mainly on the number of stimuli (Westfall et al., 2014), an interval that includes both zero and sizable effects is treated as inconclusive rather than as evidence of no difference.</w:t>
-      </w:r>
-    </w:p>
-    <w:p>
-      <w:pPr>
-        <w:pStyle w:val="Heading3"/>
-        <w:rPr>
-          <w:rFonts w:eastAsiaTheme="minorEastAsia" w:hint="eastAsia"/>
-        </w:rPr>
-      </w:pPr>
-      <w:r>
-        <w:t>RVC and V1 Descriptions</w:t>
-      </w:r>
-      <w:r>
-        <w:rPr>
-          <w:rFonts w:eastAsiaTheme="minorEastAsia" w:hint="eastAsia"/>
-        </w:rPr>
-      </w:r>
-    </w:p>
-    <w:p>
-      <w:r>
-        <w:t>The first model addresses RQ1. It includes Form (RVC vs. V1), Result Realization (Full vs. Zero), Age Group (4-year-olds, 5-year-olds, adults), and their interactions; V1 trials with stronger- and weaker-association V1s are pooled. Random effects are intercepts for participants, items (a V1–object expression and its RVC), and pairs; a by-participant slope for Result Realization; and by-item slopes for Form, Result Realization, and Age Group. The focal contrasts are the full–zero difference in acceptance for each form in each age group and the difference between these two differences (Form × Result Realization), which indicates whether Result Realization affects acceptance of the two forms differently. Comparing this interaction between children and adults and between 4- and 5-year-olds addresses the age questions in RQ1.</w:t>
-      </w:r>
-    </w:p>
-    <w:p>
-      <w:pPr>
-        <w:pStyle w:val="Heading3"/>
-      </w:pPr>
-      <w:r>
-        <w:t>Stronger- and Weaker-Association V1s</w:t>
-      </w:r>
-    </w:p>
-    <w:p>
-      <w:r>
-        <w:t>The second model addresses RQ2 and uses V1 trials only. It includes Action–Result Association (Stronger vs. Weaker), Result Realization, Age Group, and their interactions. Random effects are intercepts for participants, items, and pairs; a by-participant slope for Result Realization; by-item slopes for Result Realization and Age Group; and a by-pair slope for Action–Result Association, which allows the difference between the two V1s of a pair to vary across pairs. The focal estimates are (a) the difference in acceptance between stronger- and weaker-association V1s in zero-result events in each age group (hereafter, the association effect); (b) the Action–Result Association × Result Realization interaction, which assesses whether the association effect is larger</w:t>
-      </w:r>
-      <w:r>
-        <w:t xml:space="preserve"> in zero-result than in full-result events; and (c) the Action–Result Association × Age Group interaction in zero-result events, which assesses whether the association effect differs between children and adults. Because adult acceptance in zero-result events may approach ceiling, this interaction is reported both on the log-odds scale and as differences in predicted acceptance probability.</w:t>
-      </w:r>
-    </w:p>
-    <w:p>
-      <w:pPr>
-        <w:pStyle w:val="Heading3"/>
-      </w:pPr>
-      <w:r>
-        <w:t>Sensitivity Analyses</w:t>
-      </w:r>
-    </w:p>
-    <w:p>
-      <w:r>
-        <w:t>Three analyses assess whether the conclusions depend on the materials: (a) refitting both models with all 10 pairs, with the actions of Pairs 7 and 8 classified as stronger- or weaker-association as in the original design; (b) adding the item-level verb–video correspondence values as a covariate; and (c) refitting the models with each pair left out in turn. Because Pairs 7 and 8 were excluded after an initial analysis of the child data (see Pair Selection), analysis (a) is reported alongside the main results, and any conclusion that differs between the eight-pair and 10-pair analyses is stated. Frequentist refits are reported where they converge. These analyses are not used to select a preferred subset of items. Acceptance of each V1 and RVC description is also reported by Result Realization and Age Group, to show whether the association effect is carried by most pairs or by a few.</w:t>
-      </w:r>
-    </w:p>
-    <w:p>
-      <w:pPr>
-        <w:pStyle w:val="Heading2"/>
-      </w:pPr>
-      <w:r>
-        <w:t>Results</w:t>
-      </w:r>
-    </w:p>
-    <w:p>
-      <w:r>
-        <w:rPr/>
-        <w:t xml:space="preserve">Accuracy on filler trials was 100% for adults, 97% for 4-year-olds, and 95% for 5-year-olds, and no participant was excluded. The data comprise 1,040 critical responses, of which 832 belong to the eight retained pairs (416 RVC and 416 V1 trials). All models converged (R̂ ≤ 1.005; at most one divergent transition per model). Below, raw percentages are reported together with model-predicted acceptance (posterior medians with 95% credible intervals [CrIs], population-level predictions). Because the model predictions set item and participant effects to zero, they can differ from the raw percentages when acceptance varies strongly across items.</w:t>
-      </w:r>
-    </w:p>
-    <w:p>
-      <w:pPr>
-        <w:pStyle w:val="Heading3"/>
-      </w:pPr>
-      <w:r>
-        <w:rPr/>
-        <w:t xml:space="preserve">RVC and V1 Descriptions</w:t>
-      </w:r>
-    </w:p>
-    <w:p>
-      <w:pPr/>
-      <w:r>
-        <w:rPr/>
-        <w:t xml:space="preserve">Figure 2 shows acceptance by form, result realization, and age group. In full-result events, both forms were accepted at high rates in all groups (RVC descriptions: 92%–94%; V1 descriptions: 97%–100%). In zero-result events, RVC descriptions were rarely accepted (4-year-olds: 19%; 5-year-olds: 11%; adults: 1%), whereas V1 descriptions were accepted more often (55%, 58%, and 83%, respectively).</w:t>
       </w:r>
     </w:p>
     <w:p>
@@ -5294,7 +4526,7 @@
       </w:pPr>
       <w:r>
         <w:rPr/>
-        <w:t xml:space="preserve">Figure 2</w:t>
+        <w:t xml:space="preserve">Figure 1</w:t>
       </w:r>
     </w:p>
     <w:p>
@@ -5305,7 +4537,7 @@
         <w:rPr>
           <w:i/>
         </w:rPr>
-        <w:t xml:space="preserve">Acceptance of RVC and V1 Descriptions by Result Realization and Age Group (Experiment 1)</w:t>
+        <w:t xml:space="preserve">Stills From the Full-Result and Zero-Result Videos of Pair 2</w:t>
       </w:r>
     </w:p>
     <w:p>
@@ -5317,7 +4549,918 @@
       <w:r>
         <w:drawing>
           <wp:inline xmlns:a="http://schemas.openxmlformats.org/drawingml/2006/main" xmlns:pic="http://schemas.openxmlformats.org/drawingml/2006/picture">
-            <wp:extent cx="5486400" cy="3038622"/>
+            <wp:extent cx="5486400" cy="3525964"/>
+            <wp:docPr id="4" name="Picture 4"/>
+            <wp:cNvGraphicFramePr>
+              <a:graphicFrameLocks noChangeAspect="1"/>
+            </wp:cNvGraphicFramePr>
+            <a:graphic>
+              <a:graphicData uri="http://schemas.openxmlformats.org/drawingml/2006/picture">
+                <pic:pic>
+                  <pic:nvPicPr>
+                    <pic:cNvPr id="0" name="fig1_stills.png"/>
+                    <pic:cNvPicPr/>
+                  </pic:nvPicPr>
+                  <pic:blipFill>
+                    <a:blip r:embed="rId14"/>
+                    <a:stretch>
+                      <a:fillRect/>
+                    </a:stretch>
+                  </pic:blipFill>
+                  <pic:spPr>
+                    <a:xfrm>
+                      <a:off x="0" y="0"/>
+                      <a:ext cx="5486400" cy="3525964"/>
+                    </a:xfrm>
+                    <a:prstGeom prst="rect"/>
+                  </pic:spPr>
+                </pic:pic>
+              </a:graphicData>
+            </a:graphic>
+          </wp:inline>
+        </w:drawing>
+      </w:r>
+    </w:p>
+    <w:p>
+      <w:pPr>
+        <w:pStyle w:val="TableNote"/>
+      </w:pPr>
+      <w:r>
+        <w:rPr>
+          <w:i/>
+        </w:rPr>
+        <w:t xml:space="preserve">Note.</w:t>
+      </w:r>
+      <w:r>
+        <w:rPr/>
+        <w:t xml:space="preserve"> The actor flips (</w:t>
+      </w:r>
+      <w:r>
+        <w:rPr>
+          <w:i/>
+        </w:rPr>
+        <w:t xml:space="preserve">xiān</w:t>
+      </w:r>
+      <w:r>
+        <w:rPr/>
+        <w:t xml:space="preserve">) or slaps (</w:t>
+      </w:r>
+      <w:r>
+        <w:rPr>
+          <w:i/>
+        </w:rPr>
+        <w:t xml:space="preserve">pāi</w:t>
+      </w:r>
+      <w:r>
+        <w:rPr/>
+        <w:t xml:space="preserve">) a stool; the target result is </w:t>
+      </w:r>
+      <w:r>
+        <w:rPr>
+          <w:i/>
+        </w:rPr>
+        <w:t xml:space="preserve">fān</w:t>
+      </w:r>
+      <w:r>
+        <w:rPr/>
+        <w:t xml:space="preserve"> “overturned.” Stills show the start, middle, and end of each video.</w:t>
+      </w:r>
+    </w:p>
+    <w:p>
+      <w:pPr>
+        <w:pStyle w:val="Heading2"/>
+      </w:pPr>
+      <w:r>
+        <w:lastRenderedPageBreak/>
+        <w:t>Verb–Video Correspondence</w:t>
+      </w:r>
+    </w:p>
+    <w:p>
+      <w:r>
+        <w:t xml:space="preserve">Because each expression was paired with its own video, the comparison between the two members of a pair is also a comparison between two videos. A norming study therefore assessed whether each video elicited the intended V1. Sixteen adults (20–24 years, </w:t>
+      </w:r>
+      <w:r>
+        <w:rPr>
+          <w:i/>
+        </w:rPr>
+        <w:t>M</w:t>
+      </w:r>
+      <w:r>
+        <w:t xml:space="preserve"> = 22.4; 13 female) watched the 20 zero-result videos with the final 30% removed, so that their descriptions would focus on the action rather than the outcome. Each participant saw either the 10 videos of the stronger-association actions or the 10 videos of the weaker-association actions and described each in a full sentence. If the intended V1 did not appear, the participant was asked for another description; if it still did not appear after two attempts, the participant rated how natural the intended V1 was as a description of the action (1 = </w:t>
+      </w:r>
+      <w:r>
+        <w:rPr>
+          <w:i/>
+        </w:rPr>
+        <w:t>very unnatural</w:t>
+      </w:r>
+      <w:r>
+        <w:t xml:space="preserve">, 5 = </w:t>
+      </w:r>
+      <w:r>
+        <w:rPr>
+          <w:i/>
+        </w:rPr>
+        <w:t>very natural</w:t>
+      </w:r>
+      <w:r>
+        <w:t>). The intended V1 appeared in 62% of first descriptions and in 72% of all descriptions; when it did not appear, it was rated as natural (</w:t>
+      </w:r>
+      <w:r>
+        <w:rPr>
+          <w:i/>
+        </w:rPr>
+        <w:t>M</w:t>
+      </w:r>
+      <w:r>
+        <w:t xml:space="preserve"> = 4.32, </w:t>
+      </w:r>
+      <w:r>
+        <w:rPr>
+          <w:i/>
+        </w:rPr>
+        <w:t>SD</w:t>
+      </w:r>
+      <w:r>
+        <w:t xml:space="preserve"> = 0.79, range = 2.67–5).</w:t>
+      </w:r>
+      <w:r>
+        <w:rPr/>
+        <w:t xml:space="preserve"> Item-level values are given in Table A1 in the Appendix.</w:t>
+      </w:r>
+      <w:r>
+        <w:rPr>
+          <w:highlight w:val="yellow"/>
+        </w:rPr>
+      </w:r>
+      <w:r>
+        <w:t xml:space="preserve"> These item-level values are used as a covariate in a sensitivity analysis of Experiment 1.</w:t>
+      </w:r>
+    </w:p>
+    <w:p>
+      <w:pPr>
+        <w:pStyle w:val="Heading2"/>
+      </w:pPr>
+      <w:r>
+        <w:t>Adult Ratings of Result Likelihood and Action Typicality</w:t>
+      </w:r>
+    </w:p>
+    <w:p>
+      <w:pPr>
+        <w:rPr>
+          <w:rFonts w:eastAsiaTheme="minorEastAsia"/>
+        </w:rPr>
+      </w:pPr>
+      <w:r>
+        <w:t xml:space="preserve">Twenty native speakers of Mandarin (21–35 years, </w:t>
+      </w:r>
+      <w:r>
+        <w:rPr>
+          <w:i/>
+        </w:rPr>
+        <w:t>M</w:t>
+      </w:r>
+      <w:r>
+        <w:t xml:space="preserve"> = 28.2) </w:t>
+      </w:r>
+      <w:r>
+        <w:rPr>
+          <w:highlight w:val="yellow"/>
+        </w:rPr>
+      </w:r>
+      <w:r>
+        <w:rPr/>
+        <w:t xml:space="preserve">(9 female)</w:t>
+      </w:r>
+      <w:r>
+        <w:t xml:space="preserve"> completed an online questionnaire of about 5 min, in which they rated each of the 20 V1–object expressions in two separate blocks. After a consent statement and questions about their language background (native language, frequency of Mandarin use, and English proficiency), they were told that the questions had no correct answers and were asked to respond on the basis of their everyday experience and first intuition. In the likelihood block, each item presented a perfective sentence containing the V1–object expression, followed by a question about the target result, for example, </w:t>
+      </w:r>
+      <w:r>
+        <w:rPr>
+          <w:i/>
+        </w:rPr>
+        <w:t>Xiǎo Lǐ sī-le zhǐ</w:t>
+      </w:r>
+      <w:r>
+        <w:t xml:space="preserve"> “Xiao Li tore the paper. How likely do you think it is that the paper ended up torn?” The instructions asked participants to judge, on the basis of the sentence and their everyday experience, how likely it was that the stated result eventually occurred. They </w:t>
+      </w:r>
+      <w:r>
+        <w:lastRenderedPageBreak/>
+        <w:t xml:space="preserve">typed a number from 0 to 100, where 0 was labeled </w:t>
+      </w:r>
+      <w:r>
+        <w:rPr>
+          <w:i/>
+        </w:rPr>
+        <w:t>cannot happen</w:t>
+      </w:r>
+      <w:r>
+        <w:t xml:space="preserve"> and 100 </w:t>
+      </w:r>
+      <w:r>
+        <w:rPr>
+          <w:i/>
+        </w:rPr>
+        <w:t>will certainly happen</w:t>
+      </w:r>
+      <w:r>
+        <w:t xml:space="preserve">. In the typicality block, the instructions stated that each item first named a result that someone wanted to achieve and then an action that could be used to achieve it, and asked participants to rate how typical the action was as a way of achieving that result, for example, “Suppose Xiao Li wants to break the walnut. How typical is </w:t>
+      </w:r>
+      <w:r>
+        <w:rPr>
+          <w:i/>
+        </w:rPr>
+        <w:t>jiā hétao</w:t>
+      </w:r>
+      <w:r>
+        <w:t xml:space="preserve"> ‘clamping the walnut’ as a way of doing this?” Responses were given on a 7-point scale whose endpoints were labeled 1 (</w:t>
+      </w:r>
+      <w:r>
+        <w:rPr>
+          <w:i/>
+        </w:rPr>
+        <w:t>very atypical</w:t>
+      </w:r>
+      <w:r>
+        <w:t>) and 7 (</w:t>
+      </w:r>
+      <w:r>
+        <w:rPr>
+          <w:i/>
+        </w:rPr>
+        <w:t>very typical</w:t>
+      </w:r>
+      <w:r>
+        <w:t>); the intermediate points were numbered but not labeled. The likelihood items thus presented each expression in the same perfective form as the V1 questions of Experiment 1. Because the ratings were collected for sentences naming the expressions, they characterize the action–result relation that each expression describes, not the particular videos.</w:t>
+      </w:r>
+    </w:p>
+    <w:p>
+      <w:pPr>
+        <w:rPr>
+          <w:rFonts w:eastAsiaTheme="minorEastAsia"/>
+        </w:rPr>
+      </w:pPr>
+      <w:r>
+        <w:t>Four lists were constructed, and five raters completed each list. In all lists, the 20 likelihood items preceded the 20 typicality items. Within each block, the 10 stronger-association expressions and the 10 weaker-association expressions were presented in separate halves, with the pairs in the same order in both halves, so that the two members of each pair were always separated by nine other items. The stronger-association expressions came first in Lists 1 and 3, and the weaker-association expressions came first in Lists 2 and 4. Four different pair orders were used, two for Lists 1 and 2 and two for Lists 3 and 4, and the two blocks of each list used different orders. Because the likelihood block always came first, the typicality judgments may have been influenced by the preceding likelihood judgments. All raters completed all items, and no ratings were excluded. The ratings were collected after the child data had been collected and initially analyzed with the original Strong/Weak coding; the raters did not take part in the child experiments and received no information about children’s responses.</w:t>
+      </w:r>
+    </w:p>
+    <w:p>
+      <w:r>
+        <w:lastRenderedPageBreak/>
+        <w:t xml:space="preserve">For each rater and pair, we computed the difference between the ratings of the two expressions (expected stronger- minus expected weaker-association expression) and modeled these differences with crossed random intercepts for raters and pairs, estimated by restricted maximum likelihood. Because there were only 10 pairs, we report 95% confidence intervals from a bootstrap that resampled both raters and pairs, and exact </w:t>
+      </w:r>
+      <w:r>
+        <w:rPr>
+          <w:i/>
+        </w:rPr>
+        <w:t>p</w:t>
+      </w:r>
+      <w:r>
+        <w:t xml:space="preserve"> values from a randomization test that exchanged the two expression labels within pairs across all 2¹⁰ assignments. Across the 10 pairs, the expected stronger-association expressions received higher likelihood ratings (mean difference = 33.06 points, 95% CI [21.74, 44.70], </w:t>
+      </w:r>
+      <w:r>
+        <w:rPr>
+          <w:i/>
+        </w:rPr>
+        <w:t>p</w:t>
+      </w:r>
+      <w:r>
+        <w:t xml:space="preserve"> = .003) and higher typicality ratings (mean difference = 2.45 points, 95% CI [1.25, 3.59], </w:t>
+      </w:r>
+      <w:r>
+        <w:rPr>
+          <w:i/>
+        </w:rPr>
+        <w:t>p</w:t>
+      </w:r>
+      <w:r>
+        <w:t xml:space="preserve"> = .007). The pair-level differences in the two ratings were correlated, </w:t>
+      </w:r>
+      <w:r>
+        <w:rPr>
+          <w:i/>
+        </w:rPr>
+        <w:t>r</w:t>
+      </w:r>
+      <w:r>
+        <w:t xml:space="preserve"> = .79, permutation </w:t>
+      </w:r>
+      <w:r>
+        <w:rPr>
+          <w:i/>
+        </w:rPr>
+        <w:t>p</w:t>
+      </w:r>
+      <w:r>
+        <w:t xml:space="preserve"> = .005. Mean ratings for each expression are shown in Table 1.</w:t>
+      </w:r>
+    </w:p>
+    <w:p>
+      <w:pPr>
+        <w:pStyle w:val="Heading2"/>
+      </w:pPr>
+      <w:r>
+        <w:t>Pair Selection</w:t>
+      </w:r>
+    </w:p>
+    <w:p>
+      <w:r>
+        <w:t>A pair was retained for the analyses of Experiment 1 if the expected stronger-association expression received reliably higher ratings than its partner on both scales, as assessed by a within-rater label-exchange test for each pair (</w:t>
+      </w:r>
+      <w:r>
+        <w:rPr>
+          <w:i/>
+        </w:rPr>
+        <w:t>p</w:t>
+      </w:r>
+      <w:r>
+        <w:t xml:space="preserve"> &lt; .05, uncorrected). Eight pairs met this criterion. Two did not. In Pair 7 (</w:t>
+      </w:r>
+      <w:r>
+        <w:rPr>
+          <w:i/>
+        </w:rPr>
+        <w:t>qiā</w:t>
+      </w:r>
+      <w:r>
+        <w:t xml:space="preserve"> “pinch” vs. </w:t>
+      </w:r>
+      <w:r>
+        <w:rPr>
+          <w:i/>
+        </w:rPr>
+        <w:t>jiào</w:t>
+      </w:r>
+      <w:r>
+        <w:t xml:space="preserve"> “call” a person, with the target result </w:t>
+      </w:r>
+      <w:r>
+        <w:rPr>
+          <w:i/>
+        </w:rPr>
+        <w:t>xǐng</w:t>
+      </w:r>
+      <w:r>
+        <w:t xml:space="preserve"> “awake”), the likelihood difference was in the expected direction, but the typicality difference was reversed (−1.00 points, 95% CI [−1.70, −0.30]). In Pair 8 (</w:t>
+      </w:r>
+      <w:r>
+        <w:rPr>
+          <w:i/>
+        </w:rPr>
+        <w:t>tú</w:t>
+      </w:r>
+      <w:r>
+        <w:t xml:space="preserve"> “paint” vs. </w:t>
+      </w:r>
+      <w:r>
+        <w:rPr>
+          <w:i/>
+        </w:rPr>
+        <w:t>náo</w:t>
+      </w:r>
+      <w:r>
+        <w:t xml:space="preserve"> “scratch” a palm, with the target result </w:t>
+      </w:r>
+      <w:r>
+        <w:rPr>
+          <w:i/>
+        </w:rPr>
+        <w:t>hóng</w:t>
+      </w:r>
+      <w:r>
+        <w:t xml:space="preserve"> “red”), neither difference was reliable (likelihood: 16.40 points, 95% CI [−1.00, 33.40]; typicality: 0.45 points, 95% CI [−0.90, 1.85]). Because action–result association is defined by the two ratings jointly, the actions in these pairs cannot be classified as stronger- or weaker-association actions. The two pairs remained in the experimental lists, so all participants saw all 10 pairs, but their trials are excluded from the analyses of Experiment 1. The original design included all </w:t>
+      </w:r>
+      <w:r>
+        <w:lastRenderedPageBreak/>
+        <w:t>10 pairs, and an initial analysis of the child data used all of them with the original Strong/Weak coding. The adult ratings were collected, and Pairs 7 and 8 excluded, after that analysis. The exclusion criterion refers only to the rating data, not to children’s responses, but because both steps followed an inspection of the child data, analyses with all 10 pairs are reported alongside the main analyses of Experiment 1 (see Sensitivity Analyses).</w:t>
+      </w:r>
+    </w:p>
+    <w:p>
+      <w:r>
+        <w:t>In the eight retained pairs, the stronger-association expressions had a mean likelihood rating of 80.08 and a mean typicality rating of 6.34, compared with 42.59 and 3.21 for their weaker-association partners. Within pairs, the likelihood difference ranged from 28.90 to 67.90 points and the typicality difference from 1.30 to 4.60 points. The pair-level tests used for selection are exploratory and uncorrected for multiple comparisons. They identify pairs in which the two ratings agree; they do not establish lexical classes of V1s.</w:t>
+      </w:r>
+    </w:p>
+    <w:p>
+      <w:pPr>
+        <w:pStyle w:val="Heading2"/>
+      </w:pPr>
+      <w:r>
+        <w:t>Corpus Frequency of the Corresponding RVCs</w:t>
+      </w:r>
+    </w:p>
+    <w:p>
+      <w:r>
+        <w:t xml:space="preserve">We also examined how conventional each RVC is. As noted in the Introduction, whether a V1 and a V2 combine depends on how the action named by V1 relates to the result named by V2. If the two actions in a pair differ in their association with the target result, this difference should also be reflected in the language, such that the RVC formed with the stronger-association V1 is the more conventional one. Corpus frequency thus provides a check on the contrast between the paired V1s that does not rely on the adult ratings, although conventionality concerns the RVC as an expression rather than the action–result relation itself. We therefore searched the modern Chinese section of the CCL corpus (Zhan et al., 2019) for each of the 20 RVCs. The corpus reports the number of documents in which a string occurs rather than the number of tokens, and string matching also returns sequences in which the two characters belong to different words (e.g., </w:t>
+      </w:r>
+      <w:r>
+        <w:rPr>
+          <w:i/>
+        </w:rPr>
+        <w:t>zhǐhuī | mièhuǒ</w:t>
+      </w:r>
+      <w:r>
+        <w:t xml:space="preserve"> “command | fire-fighting” for </w:t>
+      </w:r>
+      <w:r>
+        <w:rPr>
+          <w:i/>
+        </w:rPr>
+        <w:t>huī-miè</w:t>
+      </w:r>
+      <w:r>
+        <w:t xml:space="preserve">). All matches for the </w:t>
+      </w:r>
+      <w:r>
+        <w:lastRenderedPageBreak/>
+        <w:t xml:space="preserve">less frequent RVCs were therefore checked by hand. For the more frequent RVCs, matches were segmented automatically to check for word boundaries before V1 and after V2, and 10–12 matches per RVC were checked by hand; for </w:t>
+      </w:r>
+      <w:r>
+        <w:rPr>
+          <w:i/>
+        </w:rPr>
+        <w:t>tú-hóng</w:t>
+      </w:r>
+      <w:r>
+        <w:t xml:space="preserve"> “paint-red,” a sample of 60 matches was checked. Figurative and idiomatic uses </w:t>
+      </w:r>
+      <w:r>
+        <w:rPr/>
+        <w:t xml:space="preserve">(e.g., </w:t>
+      </w:r>
+      <w:r>
+        <w:rPr>
+          <w:i/>
+        </w:rPr>
+        <w:t xml:space="preserve">chě-kāi sǎngzi</w:t>
+      </w:r>
+      <w:r>
+        <w:rPr/>
+        <w:t xml:space="preserve"> “pull-open throat,” “raise one’s voice”)</w:t>
+      </w:r>
+      <w:r>
+        <w:rPr>
+          <w:i/>
+        </w:rPr>
+      </w:r>
+      <w:r>
+        <w:t xml:space="preserve"> were counted, because they also indicate that the combination is conventional. For the RVCs checked by sampling, the number of documents was estimated by multiplying the raw document count by the proportion of checked matches that were resultative uses; for the other RVCs, all matches were checked. Document counts are shown in Table 1.</w:t>
+      </w:r>
+    </w:p>
+    <w:p>
+      <w:r>
+        <w:t xml:space="preserve">In seven of the eight retained pairs, the RVC formed with the stronger-association V1 occurred in more documents than the RVC formed with its weaker-association partner, in most pairs by more than an order of magnitude. The exception was Pair 6, in which </w:t>
+      </w:r>
+      <w:r>
+        <w:rPr>
+          <w:i/>
+        </w:rPr>
+        <w:t>tuī-dǎo</w:t>
+      </w:r>
+      <w:r>
+        <w:t xml:space="preserve"> “push-fallen” (5,750 documents) was far more frequent than </w:t>
+      </w:r>
+      <w:r>
+        <w:rPr>
+          <w:i/>
+        </w:rPr>
+        <w:t>tī-dǎo</w:t>
+      </w:r>
+      <w:r>
+        <w:t xml:space="preserve"> “kick-fallen” (480), largely because of abstract uses such as </w:t>
+      </w:r>
+      <w:r>
+        <w:rPr>
+          <w:i/>
+        </w:rPr>
+        <w:t>tuīdǎo chónglái</w:t>
+      </w:r>
+      <w:r>
+        <w:t xml:space="preserve"> “tear down and start over.” The pattern does not reflect the frequency of the V1s themselves: As single words, several weaker-association V1s (e.g., </w:t>
+      </w:r>
+      <w:r>
+        <w:rPr>
+          <w:i/>
+        </w:rPr>
+        <w:t>pāi</w:t>
+      </w:r>
+      <w:r>
+        <w:t xml:space="preserve"> “slap,” </w:t>
+      </w:r>
+      <w:r>
+        <w:rPr>
+          <w:i/>
+        </w:rPr>
+        <w:t>àn</w:t>
+      </w:r>
+      <w:r>
+        <w:t xml:space="preserve"> “press,” </w:t>
+      </w:r>
+      <w:r>
+        <w:rPr>
+          <w:i/>
+        </w:rPr>
+        <w:t>tuī</w:t>
+      </w:r>
+      <w:r>
+        <w:t xml:space="preserve"> “push,” </w:t>
+      </w:r>
+      <w:r>
+        <w:rPr>
+          <w:i/>
+        </w:rPr>
+        <w:t>chōng</w:t>
+      </w:r>
+      <w:r>
+        <w:t xml:space="preserve"> “rinse”) are more frequent than their stronger-association partners (Speer, 2022). Most weaker-association RVCs were attested, although rarely; only </w:t>
+      </w:r>
+      <w:r>
+        <w:rPr>
+          <w:i/>
+        </w:rPr>
+        <w:t>huī-miè</w:t>
+      </w:r>
+      <w:r>
+        <w:t xml:space="preserve"> “wave-extinguished” was unattested in its resultative use. The corpus data thus indicate that the RVCs formed with stronger-association V1s are more conventional, not that those formed with weaker-association V1s are unacceptable. Because the CCL corpus consists mainly of written texts, the counts do not describe children’s input. RVC frequency is reported to characterize the materials and is not entered into the analyses.</w:t>
+      </w:r>
+    </w:p>
+    <w:p>
+      <w:pPr>
+        <w:pStyle w:val="Heading1"/>
+      </w:pPr>
+      <w:r>
+        <w:lastRenderedPageBreak/>
+        <w:t>Experiment 1: Comprehension</w:t>
+      </w:r>
+    </w:p>
+    <w:p>
+      <w:pPr>
+        <w:pStyle w:val="Heading2"/>
+      </w:pPr>
+      <w:r>
+        <w:t>Method</w:t>
+      </w:r>
+    </w:p>
+    <w:p>
+      <w:pPr>
+        <w:pStyle w:val="Heading3"/>
+      </w:pPr>
+      <w:r>
+        <w:t>Participants</w:t>
+      </w:r>
+    </w:p>
+    <w:p>
+      <w:r>
+        <w:t xml:space="preserve">Participants were 32 four-year-olds </w:t>
+      </w:r>
+      <w:r>
+        <w:rPr/>
+        <w:t xml:space="preserve">(14 female; 4;0–4;10, </w:t>
+      </w:r>
+      <w:r>
+        <w:rPr>
+          <w:i/>
+        </w:rPr>
+        <w:t xml:space="preserve">M</w:t>
+      </w:r>
+      <w:r>
+        <w:rPr/>
+        <w:t xml:space="preserve"> = 4;7)</w:t>
+      </w:r>
+      <w:r>
+        <w:rPr>
+          <w:highlight w:val="yellow"/>
+        </w:rPr>
+      </w:r>
+      <w:r>
+        <w:t xml:space="preserve">, 32 five-year-olds </w:t>
+      </w:r>
+      <w:r>
+        <w:rPr/>
+        <w:t xml:space="preserve">(15 female; 5;0–5;11, </w:t>
+      </w:r>
+      <w:r>
+        <w:rPr>
+          <w:i/>
+        </w:rPr>
+        <w:t xml:space="preserve">M</w:t>
+      </w:r>
+      <w:r>
+        <w:rPr/>
+        <w:t xml:space="preserve"> = 5;5)</w:t>
+      </w:r>
+      <w:r>
+        <w:rPr>
+          <w:highlight w:val="yellow"/>
+        </w:rPr>
+      </w:r>
+      <w:r>
+        <w:t xml:space="preserve">, and 40 adults (18 female; </w:t>
+      </w:r>
+      <w:r>
+        <w:rPr/>
+        <w:t xml:space="preserve">18;4–37;3 years, </w:t>
+      </w:r>
+      <w:r>
+        <w:rPr>
+          <w:i/>
+        </w:rPr>
+        <w:t xml:space="preserve">M</w:t>
+      </w:r>
+      <w:r>
+        <w:rPr/>
+        <w:t xml:space="preserve"> = 23.1</w:t>
+      </w:r>
+      <w:r>
+        <w:rPr>
+          <w:i/>
+        </w:rPr>
+      </w:r>
+      <w:r>
+        <w:t>). Children were recruited from two kindergartens in Hunan Province, China, and adults from a university in Beijing. All participants were native speakers of Mandarin with no reported language or intellectual impairments. Guardians and adult participants gave written informed consent under a protocol approved by the university’s institutional review board. Children received a book as a gift, and adults received 10 RMB. Sample size was set before data collection at 32 children per age group, following previous studies of Mandarin verb comprehension (Chen, 2017; J. Liu, 2018).</w:t>
+      </w:r>
+    </w:p>
+    <w:p>
+      <w:pPr>
+        <w:pStyle w:val="Heading3"/>
+      </w:pPr>
+      <w:r>
+        <w:t>Design and Materials</w:t>
+      </w:r>
+    </w:p>
+    <w:p>
+      <w:r>
+        <w:t>On each trial, participants watched one critical video and answered a perfective yes–no question about it. The question contained either the RVC or the V1, with the object as a bare noun, as in (3).</w:t>
+      </w:r>
+    </w:p>
+    <w:p>
+      <w:pPr>
+        <w:pStyle w:val="ExampleFirst"/>
+      </w:pPr>
+      <w:r>
+        <w:t>(3)</w:t>
+      </w:r>
+      <w:r>
+        <w:tab/>
+        <w:t>a.</w:t>
+      </w:r>
+      <w:r>
+        <w:tab/>
+      </w:r>
+      <w:r>
+        <w:rPr>
+          <w:i/>
+        </w:rPr>
+        <w:t>Tā bāo-le lìzhī ma?</w:t>
+      </w:r>
+    </w:p>
+    <w:p>
+      <w:pPr>
+        <w:pStyle w:val="Example"/>
+      </w:pPr>
+      <w:r>
+        <w:tab/>
+      </w:r>
+      <w:r>
+        <w:tab/>
+        <w:t>she peel-PERF lychee Q</w:t>
+      </w:r>
+    </w:p>
+    <w:p>
+      <w:pPr>
+        <w:pStyle w:val="Example"/>
+      </w:pPr>
+      <w:r>
+        <w:tab/>
+      </w:r>
+      <w:r>
+        <w:tab/>
+        <w:t>“Did she peel (the) lychee?”</w:t>
+      </w:r>
+    </w:p>
+    <w:p>
+      <w:pPr>
+        <w:pStyle w:val="Example"/>
+      </w:pPr>
+      <w:r>
+        <w:tab/>
+        <w:t>b.</w:t>
+      </w:r>
+      <w:r>
+        <w:tab/>
+      </w:r>
+      <w:r>
+        <w:rPr>
+          <w:i/>
+        </w:rPr>
+        <w:t>Tā bāo-kāi-le lìzhī ma?</w:t>
+      </w:r>
+    </w:p>
+    <w:p>
+      <w:pPr>
+        <w:pStyle w:val="Example"/>
+      </w:pPr>
+      <w:r>
+        <w:tab/>
+      </w:r>
+      <w:r>
+        <w:tab/>
+        <w:t>she peel-open-PERF lychee Q</w:t>
+      </w:r>
+    </w:p>
+    <w:p>
+      <w:pPr>
+        <w:pStyle w:val="ExampleLast"/>
+      </w:pPr>
+      <w:r>
+        <w:tab/>
+      </w:r>
+      <w:r>
+        <w:tab/>
+        <w:t>“Did she peel (the) lychee open?”</w:t>
+      </w:r>
+    </w:p>
+    <w:p>
+      <w:r>
+        <w:t>Form (RVC vs. V1) and Action–Result Association (Stronger vs. Weaker) were manipulated between participants, and Result Realization (Full vs. Zero) within participants.</w:t>
+      </w:r>
+      <w:r>
+        <w:rPr>
+          <w:rFonts w:eastAsiaTheme="minorEastAsia" w:hint="eastAsia"/>
+        </w:rPr>
+      </w:r>
+      <w:r/>
+      <w:r>
+        <w:rPr>
+          <w:rFonts w:eastAsiaTheme="minorEastAsia" w:hint="eastAsia"/>
+        </w:rPr>
+      </w:r>
+      <w:r/>
+      <w:r>
+        <w:rPr>
+          <w:rFonts w:eastAsiaTheme="minorEastAsia" w:hint="eastAsia"/>
+        </w:rPr>
+      </w:r>
+      <w:r>
+        <w:t xml:space="preserve"> Eight lists crossed four event lists with the two forms. Each event list contained one action from each of the 10 pairs, either all stronger-association or all weaker-association actions, with five videos in their full-result and five in their zero-result version; across the two event lists with the same actions,</w:t>
+      </w:r>
+      <w:r>
+        <w:t xml:space="preserve"> each video appeared once in each version. Each list also contained eight filler videos (one practice and seven test trials), whose questions either matched or did not match the depicted action, to balance “yes” and “no” answers. Participants were randomly assigned to lists. In the eight retained pairs, each participant judged eight critical trials, and across lists each retained video appeared equally often in its full-result and zero-result version.</w:t>
+      </w:r>
+    </w:p>
+    <w:p>
+      <w:r>
+        <w:t>With about four children per age group and five adults per list, the V1 descriptions of the stronger-association actions, like those of the weaker-association actions, were judged by eight children per age group and 10 adults, and each V1 description in a given result condition by about four children per age group. Comparisons between stronger- and weaker-association V1s are therefore largely between participants, and item-level estimates are imprecise.</w:t>
+      </w:r>
+    </w:p>
+    <w:p>
+      <w:pPr>
+        <w:pStyle w:val="Heading3"/>
+      </w:pPr>
+      <w:r>
+        <w:t>Procedure</w:t>
+      </w:r>
+    </w:p>
+    <w:p>
+      <w:r>
+        <w:t>Children were tested individually in a quiet room in their kindergarten. After each video, they heard the question and answered orally, and an experimenter recorded the response. If a child reported not having seen the video clearly or did not answer, the video was played once more. Adults were tested online in Gorilla (Anwyl-Irvine et al., 2020); they received oral instructions from an experimenter and selected their answers themselves. Each session began with one practice trial. Acceptance was coded 1 and rejection 0.</w:t>
+      </w:r>
+    </w:p>
+    <w:p>
+      <w:pPr>
+        <w:pStyle w:val="Heading2"/>
+      </w:pPr>
+      <w:r>
+        <w:t>Analysis Plan</w:t>
+      </w:r>
+    </w:p>
+    <w:p>
+      <w:r>
+        <w:t xml:space="preserve">Trial-level acceptance is modeled with Bayesian logistic mixed-effects models in brms (Bürkner, 2017) in R (R Core Team, 2024). Bayesian estimation was chosen because near-ceiling acceptance in full-result events and in some adult conditions produces quasi-separation, and frequentist models with the required interaction structure did not converge on these data. Factors are sum-coded. Fixed effects have Normal(0, 1.5) priors, standard deviations </w:t>
+      </w:r>
+      <w:r>
+        <w:lastRenderedPageBreak/>
+        <w:t xml:space="preserve">Exponential(1) priors, and correlations LKJ(2) priors. Convergence is assessed by </w:t>
+      </w:r>
+      <w:r>
+        <w:rPr>
+          <w:i/>
+        </w:rPr>
+        <w:t>R̂</w:t>
+      </w:r>
+      <w:r>
+        <w:t xml:space="preserve"> &lt; 1.01 and adequate effective sample sizes. We report posterior medians, 95% credible intervals, and predicted acceptance probabilities, and, for directional predictions, the posterior probability that the effect has the predicted sign. Because precision in designs with few stimuli depends mainly on the number of stimuli (Westfall et al., 2014), an interval that includes both zero and sizable effects is treated as inconclusive rather than as evidence of no difference.</w:t>
+      </w:r>
+    </w:p>
+    <w:p>
+      <w:pPr>
+        <w:pStyle w:val="Heading3"/>
+        <w:rPr>
+          <w:rFonts w:eastAsiaTheme="minorEastAsia" w:hint="eastAsia"/>
+        </w:rPr>
+      </w:pPr>
+      <w:r>
+        <w:t>RVC and V1 Descriptions</w:t>
+      </w:r>
+      <w:r>
+        <w:rPr>
+          <w:rFonts w:eastAsiaTheme="minorEastAsia" w:hint="eastAsia"/>
+        </w:rPr>
+      </w:r>
+    </w:p>
+    <w:p>
+      <w:r>
+        <w:t>The first model addresses RQ1. It includes Form (RVC vs. V1), Result Realization (Full vs. Zero), Age Group (4-year-olds, 5-year-olds, adults), and their interactions; V1 trials with stronger- and weaker-association V1s are pooled. Random effects are intercepts for participants, items (a V1–object expression and its RVC), and pairs; a by-participant slope for Result Realization; and by-item slopes for Form, Result Realization, and Age Group. The focal contrasts are the full–zero difference in acceptance for each form in each age group and the difference between these two differences (Form × Result Realization), which indicates whether Result Realization affects acceptance of the two forms differently. Comparing this interaction between children and adults and between 4- and 5-year-olds addresses the age questions in RQ1.</w:t>
+      </w:r>
+    </w:p>
+    <w:p>
+      <w:pPr>
+        <w:pStyle w:val="Heading3"/>
+      </w:pPr>
+      <w:r>
+        <w:t>Stronger- and Weaker-Association V1s</w:t>
+      </w:r>
+    </w:p>
+    <w:p>
+      <w:r>
+        <w:t>The second model addresses RQ2 and uses V1 trials only. It includes Action–Result Association (Stronger vs. Weaker), Result Realization, Age Group, and their interactions. Random effects are intercepts for participants, items, and pairs; a by-participant slope for Result Realization; by-item slopes for Result Realization and Age Group; and a by-pair slope for Action–Result Association, which allows the difference between the two V1s of a pair to vary across pairs. The focal estimates are (a) the difference in acceptance between stronger- and weaker-association V1s in zero-result events in each age group (hereafter, the association effect); (b) the Action–Result Association × Result Realization interaction, which assesses whether the association effect is larger</w:t>
+      </w:r>
+      <w:r>
+        <w:t xml:space="preserve"> in zero-result than in full-result events; and (c) the Action–Result Association × Age Group interaction in zero-result events, which assesses whether the association effect differs between children and adults. Because adult acceptance in zero-result events may approach ceiling, this interaction is reported both on the log-odds scale and as differences in predicted acceptance probability.</w:t>
+      </w:r>
+    </w:p>
+    <w:p>
+      <w:pPr>
+        <w:pStyle w:val="Heading3"/>
+      </w:pPr>
+      <w:r>
+        <w:t>Sensitivity Analyses</w:t>
+      </w:r>
+    </w:p>
+    <w:p>
+      <w:r>
+        <w:t>Three analyses assess whether the conclusions depend on the materials: (a) refitting both models with all 10 pairs, with the actions of Pairs 7 and 8 classified as stronger- or weaker-association as in the original design; (b) adding the item-level verb–video correspondence values as a covariate; and (c) refitting the models with each pair left out in turn. Because Pairs 7 and 8 were excluded after an initial analysis of the child data (see Pair Selection), analysis (a) is reported alongside the main results, and any conclusion that differs between the eight-pair and 10-pair analyses is stated. Frequentist refits are reported where they converge. These analyses are not used to select a preferred subset of items. Acceptance of each V1 and RVC description is also reported by Result Realization and Age Group, to show whether the association effect is carried by most pairs or by a few.</w:t>
+      </w:r>
+    </w:p>
+    <w:p>
+      <w:pPr>
+        <w:pStyle w:val="Heading2"/>
+      </w:pPr>
+      <w:r>
+        <w:t>Results</w:t>
+      </w:r>
+    </w:p>
+    <w:p>
+      <w:r>
+        <w:rPr/>
+        <w:t xml:space="preserve">Accuracy on filler trials was 100% for adults, 97% for 4-year-olds, and 95% for 5-year-olds, and no participant was excluded. The data comprise 1,040 critical responses, of which 832 belong to the eight retained pairs (416 RVC and 416 V1 trials). All models converged (R̂ ≤ 1.005; at most one divergent transition per model). Below, raw percentages are reported together with model-predicted acceptance (posterior medians with 95% credible intervals [CrIs], population-level predictions). Because the model predictions set item and participant effects to zero, they can differ from the raw percentages when acceptance varies strongly across items.</w:t>
+      </w:r>
+    </w:p>
+    <w:p>
+      <w:pPr>
+        <w:pStyle w:val="Heading3"/>
+      </w:pPr>
+      <w:r>
+        <w:rPr/>
+        <w:t xml:space="preserve">RVC and V1 Descriptions</w:t>
+      </w:r>
+    </w:p>
+    <w:p>
+      <w:pPr/>
+      <w:r>
+        <w:rPr/>
+        <w:t xml:space="preserve">Figure 2 shows acceptance by form, result realization, and age group. In full-result events, both forms were accepted at high rates in all groups (RVC descriptions: 92%–94%; V1 descriptions: 97%–100%). In zero-result events, RVC descriptions were rarely accepted (4-year-olds: 19%; 5-year-olds: 11%; adults: 1%), whereas V1 descriptions were accepted more often (55%, 58%, and 83%, respectively).</w:t>
+      </w:r>
+    </w:p>
+    <w:p>
+      <w:pPr>
+        <w:pStyle w:val="TableNumber"/>
+      </w:pPr>
+      <w:r>
+        <w:rPr/>
+        <w:t xml:space="preserve">Figure 2</w:t>
+      </w:r>
+    </w:p>
+    <w:p>
+      <w:pPr>
+        <w:pStyle w:val="TableTitle"/>
+      </w:pPr>
+      <w:r>
+        <w:rPr>
+          <w:i/>
+        </w:rPr>
+        <w:t xml:space="preserve">Acceptance of RVC and V1 Descriptions by Result Realization and Age Group (Experiment 1)</w:t>
+      </w:r>
+    </w:p>
+    <w:p>
+      <w:pPr>
+        <w:keepNext/>
+        <w:ind w:firstLine="0"/>
+        <w:jc w:val="center"/>
+      </w:pPr>
+      <w:r>
+        <w:drawing>
+          <wp:inline xmlns:a="http://schemas.openxmlformats.org/drawingml/2006/main" xmlns:pic="http://schemas.openxmlformats.org/drawingml/2006/picture">
+            <wp:extent cx="5486400" cy="6752492"/>
             <wp:docPr id="1" name="Picture 1"/>
             <wp:cNvGraphicFramePr>
               <a:graphicFrameLocks noChangeAspect="1"/>
@@ -5338,7 +5481,7 @@
                   <pic:spPr>
                     <a:xfrm>
                       <a:off x="0" y="0"/>
-                      <a:ext cx="5486400" cy="3038622"/>
+                      <a:ext cx="5486400" cy="6752492"/>
                     </a:xfrm>
                     <a:prstGeom prst="rect"/>
                   </pic:spPr>
@@ -5361,7 +5504,7 @@
       </w:r>
       <w:r>
         <w:rPr/>
-        <w:t xml:space="preserve"> Eight retained pairs. Points show participant-level means; error bars show 95% bootstrap confidence intervals.</w:t>
+        <w:t xml:space="preserve"> Eight retained pairs. Small points show proportions for individual participants, and diamonds show group means.</w:t>
       </w:r>
     </w:p>
     <w:p>
@@ -5493,7 +5636,7 @@
       <w:r>
         <w:drawing>
           <wp:inline xmlns:a="http://schemas.openxmlformats.org/drawingml/2006/main" xmlns:pic="http://schemas.openxmlformats.org/drawingml/2006/picture">
-            <wp:extent cx="5486400" cy="3038622"/>
+            <wp:extent cx="5486400" cy="6752492"/>
             <wp:docPr id="2" name="Picture 2"/>
             <wp:cNvGraphicFramePr>
               <a:graphicFrameLocks noChangeAspect="1"/>
@@ -5514,7 +5657,7 @@
                   <pic:spPr>
                     <a:xfrm>
                       <a:off x="0" y="0"/>
-                      <a:ext cx="5486400" cy="3038622"/>
+                      <a:ext cx="5486400" cy="6752492"/>
                     </a:xfrm>
                     <a:prstGeom prst="rect"/>
                   </pic:spPr>
@@ -5537,7 +5680,7 @@
       </w:r>
       <w:r>
         <w:rPr/>
-        <w:t xml:space="preserve"> Eight retained pairs. Error bars show 95% bootstrap confidence intervals.</w:t>
+        <w:t xml:space="preserve"> Eight retained pairs. Small points show proportions for individual participants, and diamonds show group means.</w:t>
       </w:r>
     </w:p>
     <w:p>
@@ -5787,17 +5930,7 @@
       </w:r>
       <w:r>
         <w:rPr/>
-        <w:t xml:space="preserve"> “rinse” a mirror) behaved differently from the other pairs: Both V1s were accepted in all zero-result trials, and children also accepted the RVC descriptions of the zero-result videos in 50%–75% of trials. One child explained a rejection by saying that only one side of the mirror had been wiped, which suggests that the zero-result videos of this pair showed partial rather than no cleaning. </w:t>
-      </w:r>
-      <w:r>
-        <w:rPr>
-          <w:highlight w:val="yellow"/>
-        </w:rPr>
-        <w:t xml:space="preserve">[请核对 P9 的 zero-result 视频]</w:t>
-      </w:r>
-      <w:r>
-        <w:rPr/>
-        <w:t xml:space="preserve"> Acceptance of the RVC descriptions in zero-result events was otherwise low for every pair (children: 0%–38%; adults: 0%).</w:t>
+        <w:t xml:space="preserve"> “rinse” a mirror) behaved differently from the other pairs: Both V1s were accepted in all zero-result trials, and children also accepted the RVC descriptions of the zero-result videos in 50%–75% of trials. In the videos of this pair, the stain on the mirror was a small red spot in one corner and was not very conspicuous, so participants may not have noticed that it remained in the zero-result videos; one child explained a rejection by saying that only one side of the mirror had been wiped. Acceptance of the RVC descriptions in zero-result events was otherwise low for every pair (children: 0%–38%; adults: 0%).</w:t>
       </w:r>
     </w:p>
     <w:p>
@@ -5829,7 +5962,7 @@
       <w:r>
         <w:drawing>
           <wp:inline xmlns:a="http://schemas.openxmlformats.org/drawingml/2006/main" xmlns:pic="http://schemas.openxmlformats.org/drawingml/2006/picture">
-            <wp:extent cx="5486400" cy="3545058"/>
+            <wp:extent cx="5486400" cy="3376246"/>
             <wp:docPr id="3" name="Picture 3"/>
             <wp:cNvGraphicFramePr>
               <a:graphicFrameLocks noChangeAspect="1"/>
@@ -5850,7 +5983,7 @@
                   <pic:spPr>
                     <a:xfrm>
                       <a:off x="0" y="0"/>
-                      <a:ext cx="5486400" cy="3545058"/>
+                      <a:ext cx="5486400" cy="3376246"/>
                     </a:xfrm>
                     <a:prstGeom prst="rect"/>
                   </pic:spPr>
@@ -5873,7 +6006,7 @@
       </w:r>
       <w:r>
         <w:rPr/>
-        <w:t xml:space="preserve"> Children are pooled across the two age groups (eight children per V1 description); five adults per V1 description. Pair 9 is discussed in the text.</w:t>
+        <w:t xml:space="preserve"> Diamonds show proportions for each V1 description. Children are pooled across the two age groups (eight children per V1 description); five adults per V1 description. Pair 9 is discussed in the text.</w:t>
       </w:r>
     </w:p>
     <w:p>
@@ -6236,7 +6369,7 @@
         <w:rPr>
           <w:i/>
         </w:rPr>
-        <w:t xml:space="preserve">Proportion of Responses Containing an RVC and Responses Mentioning the Target Result (Experiment 2)</w:t>
+        <w:t xml:space="preserve">Proportion of Responses Containing an RVC and of Responses Mentioning the Target Result (Experiment 2)</w:t>
       </w:r>
     </w:p>
     <w:p>
@@ -6248,8 +6381,8 @@
       <w:r>
         <w:drawing>
           <wp:inline xmlns:a="http://schemas.openxmlformats.org/drawingml/2006/main" xmlns:pic="http://schemas.openxmlformats.org/drawingml/2006/picture">
-            <wp:extent cx="5486400" cy="3038622"/>
-            <wp:docPr id="4" name="Picture 4"/>
+            <wp:extent cx="5486400" cy="6752492"/>
+            <wp:docPr id="5" name="Picture 5"/>
             <wp:cNvGraphicFramePr>
               <a:graphicFrameLocks noChangeAspect="1"/>
             </wp:cNvGraphicFramePr>
@@ -6261,7 +6394,7 @@
                     <pic:cNvPicPr/>
                   </pic:nvPicPr>
                   <pic:blipFill>
-                    <a:blip r:embed="rId14"/>
+                    <a:blip r:embed="rId15"/>
                     <a:stretch>
                       <a:fillRect/>
                     </a:stretch>
@@ -6269,7 +6402,7 @@
                   <pic:spPr>
                     <a:xfrm>
                       <a:off x="0" y="0"/>
-                      <a:ext cx="5486400" cy="3038622"/>
+                      <a:ext cx="5486400" cy="6752492"/>
                     </a:xfrm>
                     <a:prstGeom prst="rect"/>
                   </pic:spPr>
@@ -6292,7 +6425,7 @@
       </w:r>
       <w:r>
         <w:rPr/>
-        <w:t xml:space="preserve"> All 10 pairs. Error bars show 95% bootstrap confidence intervals.</w:t>
+        <w:t xml:space="preserve"> All 10 pairs. Small points show proportions for individual participants, and diamonds show group means.</w:t>
       </w:r>
     </w:p>
     <w:p>
@@ -7663,17 +7796,7 @@
       </w:r>
       <w:r>
         <w:rPr/>
-        <w:t xml:space="preserve"> “kick” with a bottle and with a door, would test this directly. Third, likelihood, typicality, and RVC conventionality covary across the retained pairs. Separating them would require pairs in which they diverge, as in the excluded Pair 7, with the two ratings collected from different raters; in the present study, the same raters always gave the likelihood ratings first. Fourth, with eight pairs and with stronger- and weaker-association V1s judged by different participants, each association effect rests on few items and small groups, and item-level estimates are descriptive; in addition, the ratings were collected and two pairs excluded after an initial analysis of the same children’s data. The eight-pair results agreed with the 10-pair analyses, but the association effect needs to be replicated with a new sample of children, and the comparison of the effect between children and adults requires larger samples. Fifth, the ratings describe expressions rather than videos, and the videos did not always elicit the intended V1; in Pair 9, the zero-result videos may have shown partial rather than no cleaning. </w:t>
-      </w:r>
-      <w:r>
-        <w:rPr>
-          <w:highlight w:val="yellow"/>
-        </w:rPr>
-        <w:t xml:space="preserve">[Pair 4 和 Pair 10 的评定问卷与实验用词不完全一致，若确认需在此补充说明]</w:t>
-      </w:r>
-      <w:r>
-        <w:rPr/>
-        <w:t xml:space="preserve"> Sixth, the production data were coded with item-specific criteria that will be checked by a second coder. </w:t>
+        <w:t xml:space="preserve"> “kick” with a bottle and with a door, would test this directly. Third, likelihood, typicality, and RVC conventionality covary across the retained pairs. Separating them would require pairs in which they diverge, as in the excluded Pair 7, with the two ratings collected from different raters; in the present study, the same raters always gave the likelihood ratings first. Fourth, with eight pairs and with stronger- and weaker-association V1s judged by different participants, each association effect rests on few items and small groups, and item-level estimates are descriptive; in addition, the ratings were collected and two pairs excluded after an initial analysis of the same children’s data. The eight-pair results agreed with the 10-pair analyses, but the association effect needs to be replicated with a new sample of children, and the comparison of the effect between children and adults requires larger samples. Fifth, the ratings describe expressions rather than videos, and the videos did not always elicit the intended V1; for Pairs 4 and 10, the rating items differed slightly in wording from the experimental items; and in Pair 9, the stain on the mirror was small, so the zero-result videos may not have shown clearly that the mirror remained unclean. Sixth, the production data were coded with item-specific criteria that will be checked by a second coder. </w:t>
       </w:r>
       <w:r>
         <w:rPr>
@@ -8471,6 +8594,1374 @@
       </w:r>
       <w:r>
         <w:t>(1), 71–86.</w:t>
+      </w:r>
+    </w:p>
+    <w:p>
+      <w:pPr>
+        <w:pStyle w:val="Heading1"/>
+        <w:pageBreakBefore/>
+      </w:pPr>
+      <w:r>
+        <w:rPr/>
+        <w:t xml:space="preserve">Appendix</w:t>
+      </w:r>
+    </w:p>
+    <w:p>
+      <w:pPr>
+        <w:pStyle w:val="TableNumber"/>
+      </w:pPr>
+      <w:r>
+        <w:rPr/>
+        <w:t xml:space="preserve">Table A1</w:t>
+      </w:r>
+    </w:p>
+    <w:p>
+      <w:pPr>
+        <w:pStyle w:val="TableTitle"/>
+      </w:pPr>
+      <w:r>
+        <w:rPr>
+          <w:i/>
+        </w:rPr>
+        <w:t xml:space="preserve">Proportion of Descriptions Containing the Intended V1 in the Verb–Video Correspondence Norming</w:t>
+      </w:r>
+    </w:p>
+    <w:tbl>
+      <w:tblPr>
+        <w:tblW w:w="9360" w:type="dxa"/>
+        <w:jc w:val="center"/>
+        <w:tblBorders>
+          <w:top w:val="single" w:sz="8" w:space="0" w:color="000000"/>
+          <w:left w:val="nil"/>
+          <w:bottom w:val="single" w:sz="8" w:space="0" w:color="000000"/>
+          <w:right w:val="nil"/>
+          <w:insideH w:val="nil"/>
+          <w:insideV w:val="nil"/>
+        </w:tblBorders>
+        <w:tblCellMar>
+          <w:left w:w="58" w:type="dxa"/>
+          <w:right w:w="58" w:type="dxa"/>
+        </w:tblCellMar>
+        <w:tblLook w:val="04A0" w:firstRow="1" w:lastRow="0" w:firstColumn="1" w:lastColumn="0" w:noHBand="0" w:noVBand="1"/>
+      </w:tblPr>
+      <w:tblGrid>
+        <w:gridCol w:w="1337"/>
+        <w:gridCol w:w="1337"/>
+        <w:gridCol w:w="1337"/>
+        <w:gridCol w:w="1337"/>
+        <w:gridCol w:w="1337"/>
+        <w:gridCol w:w="1337"/>
+        <w:gridCol w:w="1337"/>
+      </w:tblGrid>
+      <w:tr>
+        <w:tc>
+          <w:tcPr>
+            <w:tcW w:type="dxa" w:w="1337"/>
+            <w:tcBorders>
+              <w:bottom w:val="single" w:sz="4" w:space="0" w:color="000000"/>
+            </w:tcBorders>
+          </w:tcPr>
+          <w:p>
+            <w:pPr>
+              <w:pStyle w:val="TableText"/>
+            </w:pPr>
+            <w:r/>
+            <w:r>
+              <w:rPr/>
+              <w:t xml:space="preserve">Pair</w:t>
+            </w:r>
+          </w:p>
+        </w:tc>
+        <w:tc>
+          <w:tcPr>
+            <w:tcW w:type="dxa" w:w="1337"/>
+            <w:tcBorders>
+              <w:bottom w:val="single" w:sz="4" w:space="0" w:color="000000"/>
+            </w:tcBorders>
+          </w:tcPr>
+          <w:p>
+            <w:pPr>
+              <w:pStyle w:val="TableText"/>
+            </w:pPr>
+            <w:r/>
+            <w:r>
+              <w:rPr/>
+              <w:t xml:space="preserve">Stronger-association V1</w:t>
+            </w:r>
+          </w:p>
+        </w:tc>
+        <w:tc>
+          <w:tcPr>
+            <w:tcW w:type="dxa" w:w="1337"/>
+            <w:tcBorders>
+              <w:bottom w:val="single" w:sz="4" w:space="0" w:color="000000"/>
+            </w:tcBorders>
+          </w:tcPr>
+          <w:p>
+            <w:pPr>
+              <w:pStyle w:val="TableText"/>
+              <w:jc w:val="center"/>
+            </w:pPr>
+            <w:r/>
+            <w:r>
+              <w:rPr/>
+              <w:t xml:space="preserve">First</w:t>
+            </w:r>
+          </w:p>
+        </w:tc>
+        <w:tc>
+          <w:tcPr>
+            <w:tcW w:type="dxa" w:w="1337"/>
+            <w:tcBorders>
+              <w:bottom w:val="single" w:sz="4" w:space="0" w:color="000000"/>
+            </w:tcBorders>
+          </w:tcPr>
+          <w:p>
+            <w:pPr>
+              <w:pStyle w:val="TableText"/>
+              <w:jc w:val="center"/>
+            </w:pPr>
+            <w:r/>
+            <w:r>
+              <w:rPr/>
+              <w:t xml:space="preserve">All</w:t>
+            </w:r>
+          </w:p>
+        </w:tc>
+        <w:tc>
+          <w:tcPr>
+            <w:tcW w:type="dxa" w:w="1337"/>
+            <w:tcBorders>
+              <w:bottom w:val="single" w:sz="4" w:space="0" w:color="000000"/>
+            </w:tcBorders>
+          </w:tcPr>
+          <w:p>
+            <w:pPr>
+              <w:pStyle w:val="TableText"/>
+            </w:pPr>
+            <w:r/>
+            <w:r>
+              <w:rPr/>
+              <w:t xml:space="preserve">Weaker-association V1</w:t>
+            </w:r>
+          </w:p>
+        </w:tc>
+        <w:tc>
+          <w:tcPr>
+            <w:tcW w:type="dxa" w:w="1337"/>
+            <w:tcBorders>
+              <w:bottom w:val="single" w:sz="4" w:space="0" w:color="000000"/>
+            </w:tcBorders>
+          </w:tcPr>
+          <w:p>
+            <w:pPr>
+              <w:pStyle w:val="TableText"/>
+              <w:jc w:val="center"/>
+            </w:pPr>
+            <w:r/>
+            <w:r>
+              <w:rPr/>
+              <w:t xml:space="preserve">First</w:t>
+            </w:r>
+          </w:p>
+        </w:tc>
+        <w:tc>
+          <w:tcPr>
+            <w:tcW w:type="dxa" w:w="1337"/>
+            <w:tcBorders>
+              <w:bottom w:val="single" w:sz="4" w:space="0" w:color="000000"/>
+            </w:tcBorders>
+          </w:tcPr>
+          <w:p>
+            <w:pPr>
+              <w:pStyle w:val="TableText"/>
+              <w:jc w:val="center"/>
+            </w:pPr>
+            <w:r/>
+            <w:r>
+              <w:rPr/>
+              <w:t xml:space="preserve">All</w:t>
+            </w:r>
+          </w:p>
+        </w:tc>
+      </w:tr>
+      <w:tr>
+        <w:tc>
+          <w:tcPr>
+            <w:tcW w:type="dxa" w:w="1337"/>
+          </w:tcPr>
+          <w:p>
+            <w:pPr>
+              <w:pStyle w:val="TableText"/>
+            </w:pPr>
+            <w:r/>
+            <w:r>
+              <w:rPr/>
+              <w:t xml:space="preserve">1</w:t>
+            </w:r>
+          </w:p>
+        </w:tc>
+        <w:tc>
+          <w:tcPr>
+            <w:tcW w:type="dxa" w:w="1337"/>
+          </w:tcPr>
+          <w:p>
+            <w:pPr>
+              <w:pStyle w:val="TableText"/>
+            </w:pPr>
+            <w:r/>
+            <w:r>
+              <w:rPr>
+                <w:i/>
+              </w:rPr>
+              <w:t xml:space="preserve">bāo</w:t>
+            </w:r>
+          </w:p>
+        </w:tc>
+        <w:tc>
+          <w:tcPr>
+            <w:tcW w:type="dxa" w:w="1337"/>
+          </w:tcPr>
+          <w:p>
+            <w:pPr>
+              <w:pStyle w:val="TableText"/>
+              <w:jc w:val="center"/>
+            </w:pPr>
+            <w:r/>
+            <w:r>
+              <w:rPr/>
+              <w:t xml:space="preserve">1.00</w:t>
+            </w:r>
+          </w:p>
+        </w:tc>
+        <w:tc>
+          <w:tcPr>
+            <w:tcW w:type="dxa" w:w="1337"/>
+          </w:tcPr>
+          <w:p>
+            <w:pPr>
+              <w:pStyle w:val="TableText"/>
+              <w:jc w:val="center"/>
+            </w:pPr>
+            <w:r/>
+            <w:r>
+              <w:rPr/>
+              <w:t xml:space="preserve">1.00</w:t>
+            </w:r>
+          </w:p>
+        </w:tc>
+        <w:tc>
+          <w:tcPr>
+            <w:tcW w:type="dxa" w:w="1337"/>
+          </w:tcPr>
+          <w:p>
+            <w:pPr>
+              <w:pStyle w:val="TableText"/>
+            </w:pPr>
+            <w:r/>
+            <w:r>
+              <w:rPr>
+                <w:i/>
+              </w:rPr>
+              <w:t xml:space="preserve">niē</w:t>
+            </w:r>
+          </w:p>
+        </w:tc>
+        <w:tc>
+          <w:tcPr>
+            <w:tcW w:type="dxa" w:w="1337"/>
+          </w:tcPr>
+          <w:p>
+            <w:pPr>
+              <w:pStyle w:val="TableText"/>
+              <w:jc w:val="center"/>
+            </w:pPr>
+            <w:r/>
+            <w:r>
+              <w:rPr/>
+              <w:t xml:space="preserve">0.25</w:t>
+            </w:r>
+          </w:p>
+        </w:tc>
+        <w:tc>
+          <w:tcPr>
+            <w:tcW w:type="dxa" w:w="1337"/>
+          </w:tcPr>
+          <w:p>
+            <w:pPr>
+              <w:pStyle w:val="TableText"/>
+              <w:jc w:val="center"/>
+            </w:pPr>
+            <w:r/>
+            <w:r>
+              <w:rPr/>
+              <w:t xml:space="preserve">0.44</w:t>
+            </w:r>
+          </w:p>
+        </w:tc>
+      </w:tr>
+      <w:tr>
+        <w:tc>
+          <w:tcPr>
+            <w:tcW w:type="dxa" w:w="1337"/>
+          </w:tcPr>
+          <w:p>
+            <w:pPr>
+              <w:pStyle w:val="TableText"/>
+            </w:pPr>
+            <w:r/>
+            <w:r>
+              <w:rPr/>
+              <w:t xml:space="preserve">2</w:t>
+            </w:r>
+          </w:p>
+        </w:tc>
+        <w:tc>
+          <w:tcPr>
+            <w:tcW w:type="dxa" w:w="1337"/>
+          </w:tcPr>
+          <w:p>
+            <w:pPr>
+              <w:pStyle w:val="TableText"/>
+            </w:pPr>
+            <w:r/>
+            <w:r>
+              <w:rPr>
+                <w:i/>
+              </w:rPr>
+              <w:t xml:space="preserve">xiān</w:t>
+            </w:r>
+          </w:p>
+        </w:tc>
+        <w:tc>
+          <w:tcPr>
+            <w:tcW w:type="dxa" w:w="1337"/>
+          </w:tcPr>
+          <w:p>
+            <w:pPr>
+              <w:pStyle w:val="TableText"/>
+              <w:jc w:val="center"/>
+            </w:pPr>
+            <w:r/>
+            <w:r>
+              <w:rPr/>
+              <w:t xml:space="preserve">0.12</w:t>
+            </w:r>
+          </w:p>
+        </w:tc>
+        <w:tc>
+          <w:tcPr>
+            <w:tcW w:type="dxa" w:w="1337"/>
+          </w:tcPr>
+          <w:p>
+            <w:pPr>
+              <w:pStyle w:val="TableText"/>
+              <w:jc w:val="center"/>
+            </w:pPr>
+            <w:r/>
+            <w:r>
+              <w:rPr/>
+              <w:t xml:space="preserve">0.18</w:t>
+            </w:r>
+          </w:p>
+        </w:tc>
+        <w:tc>
+          <w:tcPr>
+            <w:tcW w:type="dxa" w:w="1337"/>
+          </w:tcPr>
+          <w:p>
+            <w:pPr>
+              <w:pStyle w:val="TableText"/>
+            </w:pPr>
+            <w:r/>
+            <w:r>
+              <w:rPr>
+                <w:i/>
+              </w:rPr>
+              <w:t xml:space="preserve">pāi</w:t>
+            </w:r>
+          </w:p>
+        </w:tc>
+        <w:tc>
+          <w:tcPr>
+            <w:tcW w:type="dxa" w:w="1337"/>
+          </w:tcPr>
+          <w:p>
+            <w:pPr>
+              <w:pStyle w:val="TableText"/>
+              <w:jc w:val="center"/>
+            </w:pPr>
+            <w:r/>
+            <w:r>
+              <w:rPr/>
+              <w:t xml:space="preserve">1.00</w:t>
+            </w:r>
+          </w:p>
+        </w:tc>
+        <w:tc>
+          <w:tcPr>
+            <w:tcW w:type="dxa" w:w="1337"/>
+          </w:tcPr>
+          <w:p>
+            <w:pPr>
+              <w:pStyle w:val="TableText"/>
+              <w:jc w:val="center"/>
+            </w:pPr>
+            <w:r/>
+            <w:r>
+              <w:rPr/>
+              <w:t xml:space="preserve">1.00</w:t>
+            </w:r>
+          </w:p>
+        </w:tc>
+      </w:tr>
+      <w:tr>
+        <w:tc>
+          <w:tcPr>
+            <w:tcW w:type="dxa" w:w="1337"/>
+          </w:tcPr>
+          <w:p>
+            <w:pPr>
+              <w:pStyle w:val="TableText"/>
+            </w:pPr>
+            <w:r/>
+            <w:r>
+              <w:rPr/>
+              <w:t xml:space="preserve">3</w:t>
+            </w:r>
+          </w:p>
+        </w:tc>
+        <w:tc>
+          <w:tcPr>
+            <w:tcW w:type="dxa" w:w="1337"/>
+          </w:tcPr>
+          <w:p>
+            <w:pPr>
+              <w:pStyle w:val="TableText"/>
+            </w:pPr>
+            <w:r/>
+            <w:r>
+              <w:rPr>
+                <w:i/>
+              </w:rPr>
+              <w:t xml:space="preserve">bāi</w:t>
+            </w:r>
+          </w:p>
+        </w:tc>
+        <w:tc>
+          <w:tcPr>
+            <w:tcW w:type="dxa" w:w="1337"/>
+          </w:tcPr>
+          <w:p>
+            <w:pPr>
+              <w:pStyle w:val="TableText"/>
+              <w:jc w:val="center"/>
+            </w:pPr>
+            <w:r/>
+            <w:r>
+              <w:rPr/>
+              <w:t xml:space="preserve">0.88</w:t>
+            </w:r>
+          </w:p>
+        </w:tc>
+        <w:tc>
+          <w:tcPr>
+            <w:tcW w:type="dxa" w:w="1337"/>
+          </w:tcPr>
+          <w:p>
+            <w:pPr>
+              <w:pStyle w:val="TableText"/>
+              <w:jc w:val="center"/>
+            </w:pPr>
+            <w:r/>
+            <w:r>
+              <w:rPr/>
+              <w:t xml:space="preserve">0.88</w:t>
+            </w:r>
+          </w:p>
+        </w:tc>
+        <w:tc>
+          <w:tcPr>
+            <w:tcW w:type="dxa" w:w="1337"/>
+          </w:tcPr>
+          <w:p>
+            <w:pPr>
+              <w:pStyle w:val="TableText"/>
+            </w:pPr>
+            <w:r/>
+            <w:r>
+              <w:rPr>
+                <w:i/>
+              </w:rPr>
+              <w:t xml:space="preserve">àn</w:t>
+            </w:r>
+          </w:p>
+        </w:tc>
+        <w:tc>
+          <w:tcPr>
+            <w:tcW w:type="dxa" w:w="1337"/>
+          </w:tcPr>
+          <w:p>
+            <w:pPr>
+              <w:pStyle w:val="TableText"/>
+              <w:jc w:val="center"/>
+            </w:pPr>
+            <w:r/>
+            <w:r>
+              <w:rPr/>
+              <w:t xml:space="preserve">0.62</w:t>
+            </w:r>
+          </w:p>
+        </w:tc>
+        <w:tc>
+          <w:tcPr>
+            <w:tcW w:type="dxa" w:w="1337"/>
+          </w:tcPr>
+          <w:p>
+            <w:pPr>
+              <w:pStyle w:val="TableText"/>
+              <w:jc w:val="center"/>
+            </w:pPr>
+            <w:r/>
+            <w:r>
+              <w:rPr/>
+              <w:t xml:space="preserve">0.55</w:t>
+            </w:r>
+          </w:p>
+        </w:tc>
+      </w:tr>
+      <w:tr>
+        <w:tc>
+          <w:tcPr>
+            <w:tcW w:type="dxa" w:w="1337"/>
+          </w:tcPr>
+          <w:p>
+            <w:pPr>
+              <w:pStyle w:val="TableText"/>
+            </w:pPr>
+            <w:r/>
+            <w:r>
+              <w:rPr/>
+              <w:t xml:space="preserve">4</w:t>
+            </w:r>
+          </w:p>
+        </w:tc>
+        <w:tc>
+          <w:tcPr>
+            <w:tcW w:type="dxa" w:w="1337"/>
+          </w:tcPr>
+          <w:p>
+            <w:pPr>
+              <w:pStyle w:val="TableText"/>
+            </w:pPr>
+            <w:r/>
+            <w:r>
+              <w:rPr>
+                <w:i/>
+              </w:rPr>
+              <w:t xml:space="preserve">sī</w:t>
+            </w:r>
+          </w:p>
+        </w:tc>
+        <w:tc>
+          <w:tcPr>
+            <w:tcW w:type="dxa" w:w="1337"/>
+          </w:tcPr>
+          <w:p>
+            <w:pPr>
+              <w:pStyle w:val="TableText"/>
+              <w:jc w:val="center"/>
+            </w:pPr>
+            <w:r/>
+            <w:r>
+              <w:rPr/>
+              <w:t xml:space="preserve">1.00</w:t>
+            </w:r>
+          </w:p>
+        </w:tc>
+        <w:tc>
+          <w:tcPr>
+            <w:tcW w:type="dxa" w:w="1337"/>
+          </w:tcPr>
+          <w:p>
+            <w:pPr>
+              <w:pStyle w:val="TableText"/>
+              <w:jc w:val="center"/>
+            </w:pPr>
+            <w:r/>
+            <w:r>
+              <w:rPr/>
+              <w:t xml:space="preserve">1.00</w:t>
+            </w:r>
+          </w:p>
+        </w:tc>
+        <w:tc>
+          <w:tcPr>
+            <w:tcW w:type="dxa" w:w="1337"/>
+          </w:tcPr>
+          <w:p>
+            <w:pPr>
+              <w:pStyle w:val="TableText"/>
+            </w:pPr>
+            <w:r/>
+            <w:r>
+              <w:rPr>
+                <w:i/>
+              </w:rPr>
+              <w:t xml:space="preserve">chě</w:t>
+            </w:r>
+          </w:p>
+        </w:tc>
+        <w:tc>
+          <w:tcPr>
+            <w:tcW w:type="dxa" w:w="1337"/>
+          </w:tcPr>
+          <w:p>
+            <w:pPr>
+              <w:pStyle w:val="TableText"/>
+              <w:jc w:val="center"/>
+            </w:pPr>
+            <w:r/>
+            <w:r>
+              <w:rPr/>
+              <w:t xml:space="preserve">0.38</w:t>
+            </w:r>
+          </w:p>
+        </w:tc>
+        <w:tc>
+          <w:tcPr>
+            <w:tcW w:type="dxa" w:w="1337"/>
+          </w:tcPr>
+          <w:p>
+            <w:pPr>
+              <w:pStyle w:val="TableText"/>
+              <w:jc w:val="center"/>
+            </w:pPr>
+            <w:r/>
+            <w:r>
+              <w:rPr/>
+              <w:t xml:space="preserve">0.33</w:t>
+            </w:r>
+          </w:p>
+        </w:tc>
+      </w:tr>
+      <w:tr>
+        <w:tc>
+          <w:tcPr>
+            <w:tcW w:type="dxa" w:w="1337"/>
+          </w:tcPr>
+          <w:p>
+            <w:pPr>
+              <w:pStyle w:val="TableText"/>
+            </w:pPr>
+            <w:r/>
+            <w:r>
+              <w:rPr/>
+              <w:t xml:space="preserve">5</w:t>
+            </w:r>
+          </w:p>
+        </w:tc>
+        <w:tc>
+          <w:tcPr>
+            <w:tcW w:type="dxa" w:w="1337"/>
+          </w:tcPr>
+          <w:p>
+            <w:pPr>
+              <w:pStyle w:val="TableText"/>
+            </w:pPr>
+            <w:r/>
+            <w:r>
+              <w:rPr>
+                <w:i/>
+              </w:rPr>
+              <w:t xml:space="preserve">chuī</w:t>
+            </w:r>
+          </w:p>
+        </w:tc>
+        <w:tc>
+          <w:tcPr>
+            <w:tcW w:type="dxa" w:w="1337"/>
+          </w:tcPr>
+          <w:p>
+            <w:pPr>
+              <w:pStyle w:val="TableText"/>
+              <w:jc w:val="center"/>
+            </w:pPr>
+            <w:r/>
+            <w:r>
+              <w:rPr/>
+              <w:t xml:space="preserve">1.00</w:t>
+            </w:r>
+          </w:p>
+        </w:tc>
+        <w:tc>
+          <w:tcPr>
+            <w:tcW w:type="dxa" w:w="1337"/>
+          </w:tcPr>
+          <w:p>
+            <w:pPr>
+              <w:pStyle w:val="TableText"/>
+              <w:jc w:val="center"/>
+            </w:pPr>
+            <w:r/>
+            <w:r>
+              <w:rPr/>
+              <w:t xml:space="preserve">1.00</w:t>
+            </w:r>
+          </w:p>
+        </w:tc>
+        <w:tc>
+          <w:tcPr>
+            <w:tcW w:type="dxa" w:w="1337"/>
+          </w:tcPr>
+          <w:p>
+            <w:pPr>
+              <w:pStyle w:val="TableText"/>
+            </w:pPr>
+            <w:r/>
+            <w:r>
+              <w:rPr>
+                <w:i/>
+              </w:rPr>
+              <w:t xml:space="preserve">huī</w:t>
+            </w:r>
+          </w:p>
+        </w:tc>
+        <w:tc>
+          <w:tcPr>
+            <w:tcW w:type="dxa" w:w="1337"/>
+          </w:tcPr>
+          <w:p>
+            <w:pPr>
+              <w:pStyle w:val="TableText"/>
+              <w:jc w:val="center"/>
+            </w:pPr>
+            <w:r/>
+            <w:r>
+              <w:rPr/>
+              <w:t xml:space="preserve">0.50</w:t>
+            </w:r>
+          </w:p>
+        </w:tc>
+        <w:tc>
+          <w:tcPr>
+            <w:tcW w:type="dxa" w:w="1337"/>
+          </w:tcPr>
+          <w:p>
+            <w:pPr>
+              <w:pStyle w:val="TableText"/>
+              <w:jc w:val="center"/>
+            </w:pPr>
+            <w:r/>
+            <w:r>
+              <w:rPr/>
+              <w:t xml:space="preserve">0.50</w:t>
+            </w:r>
+          </w:p>
+        </w:tc>
+      </w:tr>
+      <w:tr>
+        <w:tc>
+          <w:tcPr>
+            <w:tcW w:type="dxa" w:w="1337"/>
+          </w:tcPr>
+          <w:p>
+            <w:pPr>
+              <w:pStyle w:val="TableText"/>
+            </w:pPr>
+            <w:r/>
+            <w:r>
+              <w:rPr/>
+              <w:t xml:space="preserve">6</w:t>
+            </w:r>
+          </w:p>
+        </w:tc>
+        <w:tc>
+          <w:tcPr>
+            <w:tcW w:type="dxa" w:w="1337"/>
+          </w:tcPr>
+          <w:p>
+            <w:pPr>
+              <w:pStyle w:val="TableText"/>
+            </w:pPr>
+            <w:r/>
+            <w:r>
+              <w:rPr>
+                <w:i/>
+              </w:rPr>
+              <w:t xml:space="preserve">tī</w:t>
+            </w:r>
+          </w:p>
+        </w:tc>
+        <w:tc>
+          <w:tcPr>
+            <w:tcW w:type="dxa" w:w="1337"/>
+          </w:tcPr>
+          <w:p>
+            <w:pPr>
+              <w:pStyle w:val="TableText"/>
+              <w:jc w:val="center"/>
+            </w:pPr>
+            <w:r/>
+            <w:r>
+              <w:rPr/>
+              <w:t xml:space="preserve">0.75</w:t>
+            </w:r>
+          </w:p>
+        </w:tc>
+        <w:tc>
+          <w:tcPr>
+            <w:tcW w:type="dxa" w:w="1337"/>
+          </w:tcPr>
+          <w:p>
+            <w:pPr>
+              <w:pStyle w:val="TableText"/>
+              <w:jc w:val="center"/>
+            </w:pPr>
+            <w:r/>
+            <w:r>
+              <w:rPr/>
+              <w:t xml:space="preserve">0.70</w:t>
+            </w:r>
+          </w:p>
+        </w:tc>
+        <w:tc>
+          <w:tcPr>
+            <w:tcW w:type="dxa" w:w="1337"/>
+          </w:tcPr>
+          <w:p>
+            <w:pPr>
+              <w:pStyle w:val="TableText"/>
+            </w:pPr>
+            <w:r/>
+            <w:r>
+              <w:rPr>
+                <w:i/>
+              </w:rPr>
+              <w:t xml:space="preserve">tuī</w:t>
+            </w:r>
+          </w:p>
+        </w:tc>
+        <w:tc>
+          <w:tcPr>
+            <w:tcW w:type="dxa" w:w="1337"/>
+          </w:tcPr>
+          <w:p>
+            <w:pPr>
+              <w:pStyle w:val="TableText"/>
+              <w:jc w:val="center"/>
+            </w:pPr>
+            <w:r/>
+            <w:r>
+              <w:rPr/>
+              <w:t xml:space="preserve">1.00</w:t>
+            </w:r>
+          </w:p>
+        </w:tc>
+        <w:tc>
+          <w:tcPr>
+            <w:tcW w:type="dxa" w:w="1337"/>
+          </w:tcPr>
+          <w:p>
+            <w:pPr>
+              <w:pStyle w:val="TableText"/>
+              <w:jc w:val="center"/>
+            </w:pPr>
+            <w:r/>
+            <w:r>
+              <w:rPr/>
+              <w:t xml:space="preserve">1.00</w:t>
+            </w:r>
+          </w:p>
+        </w:tc>
+      </w:tr>
+      <w:tr>
+        <w:tc>
+          <w:tcPr>
+            <w:tcW w:type="dxa" w:w="1337"/>
+          </w:tcPr>
+          <w:p>
+            <w:pPr>
+              <w:pStyle w:val="TableText"/>
+            </w:pPr>
+            <w:r/>
+            <w:r>
+              <w:rPr/>
+              <w:t xml:space="preserve">7ᵃ</w:t>
+            </w:r>
+          </w:p>
+        </w:tc>
+        <w:tc>
+          <w:tcPr>
+            <w:tcW w:type="dxa" w:w="1337"/>
+          </w:tcPr>
+          <w:p>
+            <w:pPr>
+              <w:pStyle w:val="TableText"/>
+            </w:pPr>
+            <w:r/>
+            <w:r>
+              <w:rPr>
+                <w:i/>
+              </w:rPr>
+              <w:t xml:space="preserve">qiā</w:t>
+            </w:r>
+          </w:p>
+        </w:tc>
+        <w:tc>
+          <w:tcPr>
+            <w:tcW w:type="dxa" w:w="1337"/>
+          </w:tcPr>
+          <w:p>
+            <w:pPr>
+              <w:pStyle w:val="TableText"/>
+              <w:jc w:val="center"/>
+            </w:pPr>
+            <w:r/>
+            <w:r>
+              <w:rPr/>
+              <w:t xml:space="preserve">0.62</w:t>
+            </w:r>
+          </w:p>
+        </w:tc>
+        <w:tc>
+          <w:tcPr>
+            <w:tcW w:type="dxa" w:w="1337"/>
+          </w:tcPr>
+          <w:p>
+            <w:pPr>
+              <w:pStyle w:val="TableText"/>
+              <w:jc w:val="center"/>
+            </w:pPr>
+            <w:r/>
+            <w:r>
+              <w:rPr/>
+              <w:t xml:space="preserve">0.80</w:t>
+            </w:r>
+          </w:p>
+        </w:tc>
+        <w:tc>
+          <w:tcPr>
+            <w:tcW w:type="dxa" w:w="1337"/>
+          </w:tcPr>
+          <w:p>
+            <w:pPr>
+              <w:pStyle w:val="TableText"/>
+            </w:pPr>
+            <w:r/>
+            <w:r>
+              <w:rPr>
+                <w:i/>
+              </w:rPr>
+              <w:t xml:space="preserve">jiào</w:t>
+            </w:r>
+          </w:p>
+        </w:tc>
+        <w:tc>
+          <w:tcPr>
+            <w:tcW w:type="dxa" w:w="1337"/>
+          </w:tcPr>
+          <w:p>
+            <w:pPr>
+              <w:pStyle w:val="TableText"/>
+              <w:jc w:val="center"/>
+            </w:pPr>
+            <w:r/>
+            <w:r>
+              <w:rPr/>
+              <w:t xml:space="preserve">1.00</w:t>
+            </w:r>
+          </w:p>
+        </w:tc>
+        <w:tc>
+          <w:tcPr>
+            <w:tcW w:type="dxa" w:w="1337"/>
+          </w:tcPr>
+          <w:p>
+            <w:pPr>
+              <w:pStyle w:val="TableText"/>
+              <w:jc w:val="center"/>
+            </w:pPr>
+            <w:r/>
+            <w:r>
+              <w:rPr/>
+              <w:t xml:space="preserve">1.00</w:t>
+            </w:r>
+          </w:p>
+        </w:tc>
+      </w:tr>
+      <w:tr>
+        <w:tc>
+          <w:tcPr>
+            <w:tcW w:type="dxa" w:w="1337"/>
+          </w:tcPr>
+          <w:p>
+            <w:pPr>
+              <w:pStyle w:val="TableText"/>
+            </w:pPr>
+            <w:r/>
+            <w:r>
+              <w:rPr/>
+              <w:t xml:space="preserve">8ᵃ</w:t>
+            </w:r>
+          </w:p>
+        </w:tc>
+        <w:tc>
+          <w:tcPr>
+            <w:tcW w:type="dxa" w:w="1337"/>
+          </w:tcPr>
+          <w:p>
+            <w:pPr>
+              <w:pStyle w:val="TableText"/>
+            </w:pPr>
+            <w:r/>
+            <w:r>
+              <w:rPr>
+                <w:i/>
+              </w:rPr>
+              <w:t xml:space="preserve">tú</w:t>
+            </w:r>
+          </w:p>
+        </w:tc>
+        <w:tc>
+          <w:tcPr>
+            <w:tcW w:type="dxa" w:w="1337"/>
+          </w:tcPr>
+          <w:p>
+            <w:pPr>
+              <w:pStyle w:val="TableText"/>
+              <w:jc w:val="center"/>
+            </w:pPr>
+            <w:r/>
+            <w:r>
+              <w:rPr/>
+              <w:t xml:space="preserve">0.88</w:t>
+            </w:r>
+          </w:p>
+        </w:tc>
+        <w:tc>
+          <w:tcPr>
+            <w:tcW w:type="dxa" w:w="1337"/>
+          </w:tcPr>
+          <w:p>
+            <w:pPr>
+              <w:pStyle w:val="TableText"/>
+              <w:jc w:val="center"/>
+            </w:pPr>
+            <w:r/>
+            <w:r>
+              <w:rPr/>
+              <w:t xml:space="preserve">0.89</w:t>
+            </w:r>
+          </w:p>
+        </w:tc>
+        <w:tc>
+          <w:tcPr>
+            <w:tcW w:type="dxa" w:w="1337"/>
+          </w:tcPr>
+          <w:p>
+            <w:pPr>
+              <w:pStyle w:val="TableText"/>
+            </w:pPr>
+            <w:r/>
+            <w:r>
+              <w:rPr>
+                <w:i/>
+              </w:rPr>
+              <w:t xml:space="preserve">náo</w:t>
+            </w:r>
+          </w:p>
+        </w:tc>
+        <w:tc>
+          <w:tcPr>
+            <w:tcW w:type="dxa" w:w="1337"/>
+          </w:tcPr>
+          <w:p>
+            <w:pPr>
+              <w:pStyle w:val="TableText"/>
+              <w:jc w:val="center"/>
+            </w:pPr>
+            <w:r/>
+            <w:r>
+              <w:rPr/>
+              <w:t xml:space="preserve">1.00</w:t>
+            </w:r>
+          </w:p>
+        </w:tc>
+        <w:tc>
+          <w:tcPr>
+            <w:tcW w:type="dxa" w:w="1337"/>
+          </w:tcPr>
+          <w:p>
+            <w:pPr>
+              <w:pStyle w:val="TableText"/>
+              <w:jc w:val="center"/>
+            </w:pPr>
+            <w:r/>
+            <w:r>
+              <w:rPr/>
+              <w:t xml:space="preserve">1.00</w:t>
+            </w:r>
+          </w:p>
+        </w:tc>
+      </w:tr>
+      <w:tr>
+        <w:tc>
+          <w:tcPr>
+            <w:tcW w:type="dxa" w:w="1337"/>
+          </w:tcPr>
+          <w:p>
+            <w:pPr>
+              <w:pStyle w:val="TableText"/>
+            </w:pPr>
+            <w:r/>
+            <w:r>
+              <w:rPr/>
+              <w:t xml:space="preserve">9</w:t>
+            </w:r>
+          </w:p>
+        </w:tc>
+        <w:tc>
+          <w:tcPr>
+            <w:tcW w:type="dxa" w:w="1337"/>
+          </w:tcPr>
+          <w:p>
+            <w:pPr>
+              <w:pStyle w:val="TableText"/>
+            </w:pPr>
+            <w:r/>
+            <w:r>
+              <w:rPr>
+                <w:i/>
+              </w:rPr>
+              <w:t xml:space="preserve">cā</w:t>
+            </w:r>
+          </w:p>
+        </w:tc>
+        <w:tc>
+          <w:tcPr>
+            <w:tcW w:type="dxa" w:w="1337"/>
+          </w:tcPr>
+          <w:p>
+            <w:pPr>
+              <w:pStyle w:val="TableText"/>
+              <w:jc w:val="center"/>
+            </w:pPr>
+            <w:r/>
+            <w:r>
+              <w:rPr/>
+              <w:t xml:space="preserve">1.00</w:t>
+            </w:r>
+          </w:p>
+        </w:tc>
+        <w:tc>
+          <w:tcPr>
+            <w:tcW w:type="dxa" w:w="1337"/>
+          </w:tcPr>
+          <w:p>
+            <w:pPr>
+              <w:pStyle w:val="TableText"/>
+              <w:jc w:val="center"/>
+            </w:pPr>
+            <w:r/>
+            <w:r>
+              <w:rPr/>
+              <w:t xml:space="preserve">1.00</w:t>
+            </w:r>
+          </w:p>
+        </w:tc>
+        <w:tc>
+          <w:tcPr>
+            <w:tcW w:type="dxa" w:w="1337"/>
+          </w:tcPr>
+          <w:p>
+            <w:pPr>
+              <w:pStyle w:val="TableText"/>
+            </w:pPr>
+            <w:r/>
+            <w:r>
+              <w:rPr>
+                <w:i/>
+              </w:rPr>
+              <w:t xml:space="preserve">chōng</w:t>
+            </w:r>
+          </w:p>
+        </w:tc>
+        <w:tc>
+          <w:tcPr>
+            <w:tcW w:type="dxa" w:w="1337"/>
+          </w:tcPr>
+          <w:p>
+            <w:pPr>
+              <w:pStyle w:val="TableText"/>
+              <w:jc w:val="center"/>
+            </w:pPr>
+            <w:r/>
+            <w:r>
+              <w:rPr/>
+              <w:t xml:space="preserve">0.55</w:t>
+            </w:r>
+          </w:p>
+        </w:tc>
+        <w:tc>
+          <w:tcPr>
+            <w:tcW w:type="dxa" w:w="1337"/>
+          </w:tcPr>
+          <w:p>
+            <w:pPr>
+              <w:pStyle w:val="TableText"/>
+              <w:jc w:val="center"/>
+            </w:pPr>
+            <w:r/>
+            <w:r>
+              <w:rPr/>
+              <w:t xml:space="preserve">0.73</w:t>
+            </w:r>
+          </w:p>
+        </w:tc>
+      </w:tr>
+      <w:tr>
+        <w:tc>
+          <w:tcPr>
+            <w:tcW w:type="dxa" w:w="1337"/>
+          </w:tcPr>
+          <w:p>
+            <w:pPr>
+              <w:pStyle w:val="TableText"/>
+            </w:pPr>
+            <w:r/>
+            <w:r>
+              <w:rPr/>
+              <w:t xml:space="preserve">10</w:t>
+            </w:r>
+          </w:p>
+        </w:tc>
+        <w:tc>
+          <w:tcPr>
+            <w:tcW w:type="dxa" w:w="1337"/>
+          </w:tcPr>
+          <w:p>
+            <w:pPr>
+              <w:pStyle w:val="TableText"/>
+            </w:pPr>
+            <w:r/>
+            <w:r>
+              <w:rPr>
+                <w:i/>
+              </w:rPr>
+              <w:t xml:space="preserve">jiā</w:t>
+            </w:r>
+          </w:p>
+        </w:tc>
+        <w:tc>
+          <w:tcPr>
+            <w:tcW w:type="dxa" w:w="1337"/>
+          </w:tcPr>
+          <w:p>
+            <w:pPr>
+              <w:pStyle w:val="TableText"/>
+              <w:jc w:val="center"/>
+            </w:pPr>
+            <w:r/>
+            <w:r>
+              <w:rPr/>
+              <w:t xml:space="preserve">0.62</w:t>
+            </w:r>
+          </w:p>
+        </w:tc>
+        <w:tc>
+          <w:tcPr>
+            <w:tcW w:type="dxa" w:w="1337"/>
+          </w:tcPr>
+          <w:p>
+            <w:pPr>
+              <w:pStyle w:val="TableText"/>
+              <w:jc w:val="center"/>
+            </w:pPr>
+            <w:r/>
+            <w:r>
+              <w:rPr/>
+              <w:t xml:space="preserve">0.64</w:t>
+            </w:r>
+          </w:p>
+        </w:tc>
+        <w:tc>
+          <w:tcPr>
+            <w:tcW w:type="dxa" w:w="1337"/>
+          </w:tcPr>
+          <w:p>
+            <w:pPr>
+              <w:pStyle w:val="TableText"/>
+            </w:pPr>
+            <w:r/>
+            <w:r>
+              <w:rPr>
+                <w:i/>
+              </w:rPr>
+              <w:t xml:space="preserve">chuí</w:t>
+            </w:r>
+          </w:p>
+        </w:tc>
+        <w:tc>
+          <w:tcPr>
+            <w:tcW w:type="dxa" w:w="1337"/>
+          </w:tcPr>
+          <w:p>
+            <w:pPr>
+              <w:pStyle w:val="TableText"/>
+              <w:jc w:val="center"/>
+            </w:pPr>
+            <w:r/>
+            <w:r>
+              <w:rPr/>
+              <w:t xml:space="preserve">0.38</w:t>
+            </w:r>
+          </w:p>
+        </w:tc>
+        <w:tc>
+          <w:tcPr>
+            <w:tcW w:type="dxa" w:w="1337"/>
+          </w:tcPr>
+          <w:p>
+            <w:pPr>
+              <w:pStyle w:val="TableText"/>
+              <w:jc w:val="center"/>
+            </w:pPr>
+            <w:r/>
+            <w:r>
+              <w:rPr/>
+              <w:t xml:space="preserve">0.36</w:t>
+            </w:r>
+          </w:p>
+        </w:tc>
+      </w:tr>
+    </w:tbl>
+    <w:p>
+      <w:pPr>
+        <w:pStyle w:val="TableNote"/>
+        <w:rPr>
+          <w:rFonts w:eastAsiaTheme="minorEastAsia"/>
+        </w:rPr>
+      </w:pPr>
+      <w:r>
+        <w:rPr>
+          <w:i/>
+        </w:rPr>
+        <w:t xml:space="preserve">Note.</w:t>
+      </w:r>
+      <w:r>
+        <w:rPr/>
+        <w:t xml:space="preserve"> First = proportion of participants whose first description contained the intended V1; All = proportion of all descriptions, including those given on request, that contained the intended V1 (</w:t>
+      </w:r>
+      <w:r>
+        <w:rPr>
+          <w:i/>
+        </w:rPr>
+        <w:t xml:space="preserve">n</w:t>
+      </w:r>
+      <w:r>
+        <w:rPr/>
+        <w:t xml:space="preserve"> = 8 participants per video). The All values are used as the covariate in the sensitivity analysis of Experiment 1. ᵃ Excluded from the analyses of Experiment 1.</w:t>
       </w:r>
     </w:p>
     <w:sectPr>

</xml_diff>

<commit_message>
R15: covariate sensitivity results, Pair 9 explanation, rating-wording note, rebuilt draft
Co-Authored-By: Claude Opus 5.5 <noreply@anthropic.com>
Claude-Session: https://claude.ai/code/session_01Q96WePso3R7jviE8KBARip
</commit_message>
<xml_diff>
--- a/drafts/Manuscript_R15_full_draft.docx
+++ b/drafts/Manuscript_R15_full_draft.docx
@@ -4721,16 +4721,16 @@
         <w:t>M</w:t>
       </w:r>
       <w:r>
-        <w:t xml:space="preserve"> = 28.2) </w:t>
+        <w:t xml:space="preserve"> = 28.2</w:t>
+      </w:r>
+      <w:r>
+        <w:rPr/>
+        <w:t xml:space="preserve">; 9 female)</w:t>
       </w:r>
       <w:r>
         <w:rPr>
           <w:highlight w:val="yellow"/>
         </w:rPr>
-      </w:r>
-      <w:r>
-        <w:rPr/>
-        <w:t xml:space="preserve">(9 female)</w:t>
       </w:r>
       <w:r>
         <w:t xml:space="preserve"> completed an online questionnaire of about 5 min, in which they rated each of the 20 V1–object expressions in two separate blocks. After a consent statement and questions about their language background (native language, frequency of Mandarin use, and English proficiency), they were told that the questions had no correct answers and were asked to respond on the basis of their everyday experience and first intuition. In the likelihood block, each item presented a perfective sentence containing the V1–object expression, followed by a question about the target result, for example, </w:t>
@@ -5897,13 +5897,17 @@
       </w:r>
       <w:r>
         <w:rPr/>
-        <w:t xml:space="preserve"> = .71. The analysis with the verb–video correspondence covariate has not yet been carried out. </w:t>
-      </w:r>
-      <w:r>
-        <w:rPr>
-          <w:highlight w:val="yellow"/>
-        </w:rPr>
-        <w:t xml:space="preserve">[待逐项数值到位后补做]</w:t>
+        <w:t xml:space="preserve"> = .71. Adding the item-level verb–video correspondence values (Table A1, proportion of all descriptions containing the intended V1, centered) and their interaction with Result Realization as covariates did not change the conclusions. The covariate effects were small and uncertain (Model 1: 0.20 [−1.67, 2.08]; Model 2: −0.13 [−2.42, 2.21]). The Form × Result Realization interaction was 0.49 [−2.93, 3.45] for 4-year-olds, 2.70 [−0.45, 5.73] for 5-year-olds, and 6.38 [−0.21, 11.90] for adults, and the association effect in zero-result events, averaged over age groups, was 3.86 [1.13, 6.88], </w:t>
+      </w:r>
+      <w:r>
+        <w:rPr>
+          <w:i/>
+        </w:rPr>
+        <w:t xml:space="preserve">p</w:t>
+      </w:r>
+      <w:r>
+        <w:rPr/>
+        <w:t xml:space="preserve">(&gt; 0) &gt; .99, with no credible difference between children and adults (log-odds: −1.16 [−5.58, 2.96]; probability: 0.32 [−0.29, 0.72]).</w:t>
       </w:r>
     </w:p>
     <w:p>

</xml_diff>

<commit_message>
R15: cite Song & Haryu (2025) on endstate salience for Pair 9, salience limitation, 74% first descriptions, chong 0.75, rating wording follows experimental items
Co-Authored-By: Claude Opus 5.5 <noreply@anthropic.com>
Claude-Session: https://claude.ai/code/session_01Q96WePso3R7jviE8KBARip
</commit_message>
<xml_diff>
--- a/drafts/Manuscript_R15_full_draft.docx
+++ b/drafts/Manuscript_R15_full_draft.docx
@@ -2604,7 +2604,8 @@
               <w:keepNext/>
             </w:pPr>
             <w:r>
-              <w:t>4ᵉ</w:t>
+              <w:lastRenderedPageBreak/>
+              <w:t>4</w:t>
             </w:r>
           </w:p>
         </w:tc>
@@ -4152,7 +4153,7 @@
               <w:keepNext/>
             </w:pPr>
             <w:r>
-              <w:t>10ᵉ</w:t>
+              <w:t>10</w:t>
             </w:r>
           </w:p>
         </w:tc>
@@ -4427,57 +4428,7 @@
       </w:r>
       <w:r>
         <w:rPr/>
-        <w:t xml:space="preserve"> “pull-open throat,” “raise one’s voice.” ᵉ The rating items for this pair used </w:t>
-      </w:r>
-      <w:r>
-        <w:rPr>
-          <w:i/>
-        </w:rPr>
-        <w:t xml:space="preserve">zhuài</w:t>
-      </w:r>
-      <w:r>
-        <w:rPr/>
-        <w:t xml:space="preserve"> “drag” instead of </w:t>
-      </w:r>
-      <w:r>
-        <w:rPr>
-          <w:i/>
-        </w:rPr>
-        <w:t xml:space="preserve">chě</w:t>
-      </w:r>
-      <w:r>
-        <w:rPr/>
-        <w:t xml:space="preserve"> and the target result </w:t>
-      </w:r>
-      <w:r>
-        <w:rPr>
-          <w:i/>
-        </w:rPr>
-        <w:t xml:space="preserve">pò</w:t>
-      </w:r>
-      <w:r>
-        <w:rPr/>
-        <w:t xml:space="preserve"> “torn” (Pair 4) or </w:t>
-      </w:r>
-      <w:r>
-        <w:rPr>
-          <w:i/>
-        </w:rPr>
-        <w:t xml:space="preserve">suì</w:t>
-      </w:r>
-      <w:r>
-        <w:rPr/>
-        <w:t xml:space="preserve"> “smashed” (Pair 10) instead of </w:t>
-      </w:r>
-      <w:r>
-        <w:rPr>
-          <w:i/>
-        </w:rPr>
-        <w:t xml:space="preserve">kāi</w:t>
-      </w:r>
-      <w:r>
-        <w:rPr/>
-        <w:t xml:space="preserve"> “open.”</w:t>
+        <w:t xml:space="preserve"> “pull-open throat,” “raise one’s voice.”</w:t>
       </w:r>
     </w:p>
     <w:p>
@@ -4664,7 +4615,15 @@
         <w:t>very natural</w:t>
       </w:r>
       <w:r>
-        <w:t>). The intended V1 appeared in 62% of first descriptions and in 72% of all descriptions; when it did not appear, it was rated as natural (</w:t>
+        <w:t xml:space="preserve">). The intended V1 </w:t>
+      </w:r>
+      <w:r>
+        <w:rPr/>
+        <w:t xml:space="preserve">appeared in 74% of first descriptions</w:t>
+      </w:r>
+      <w:r>
+        <w:rPr/>
+        <w:t xml:space="preserve"> and in 72% of all descriptions; when it did not appear, it was rated as natural (</w:t>
       </w:r>
       <w:r>
         <w:rPr>
@@ -4742,7 +4701,15 @@
         <w:t>Xiǎo Lǐ sī-le zhǐ</w:t>
       </w:r>
       <w:r>
-        <w:t xml:space="preserve"> “Xiao Li tore the paper. How likely do you think it is that the paper ended up torn?” The instructions asked participants to judge, on the basis of the sentence and their everyday experience, how likely it was that the stated result eventually occurred. They </w:t>
+        <w:t xml:space="preserve"> “Xiao Li tore the paper. How likely do you think it is that </w:t>
+      </w:r>
+      <w:r>
+        <w:rPr/>
+        <w:t xml:space="preserve">the paper ended up torn apart?</w:t>
+      </w:r>
+      <w:r>
+        <w:rPr/>
+        <w:t xml:space="preserve">” The instructions asked participants to judge, on the basis of the sentence and their everyday experience, how likely it was that the stated result eventually occurred. They </w:t>
       </w:r>
       <w:r>
         <w:lastRenderedPageBreak/>
@@ -4764,7 +4731,15 @@
         <w:t>will certainly happen</w:t>
       </w:r>
       <w:r>
-        <w:t xml:space="preserve">. In the typicality block, the instructions stated that each item first named a result that someone wanted to achieve and then an action that could be used to achieve it, and asked participants to rate how typical the action was as a way of achieving that result, for example, “Suppose Xiao Li wants to break the walnut. How typical is </w:t>
+        <w:t xml:space="preserve">. In the typicality block, the instructions stated that each item first named a result that someone wanted to achieve and then an action that could be used to achieve it, and asked participants to rate how typical the action was as a way of achieving that result, for example, “Suppose Xiao Li </w:t>
+      </w:r>
+      <w:r>
+        <w:rPr/>
+        <w:t xml:space="preserve">wants to crack the walnut open.</w:t>
+      </w:r>
+      <w:r>
+        <w:rPr/>
+        <w:t xml:space="preserve"> How typical is </w:t>
       </w:r>
       <w:r>
         <w:rPr>
@@ -5934,7 +5909,37 @@
       </w:r>
       <w:r>
         <w:rPr/>
-        <w:t xml:space="preserve"> “rinse” a mirror) behaved differently from the other pairs: Both V1s were accepted in all zero-result trials, and children also accepted the RVC descriptions of the zero-result videos in 50%–75% of trials. In the videos of this pair, the stain on the mirror was a small red spot in one corner and was not very conspicuous, so participants may not have noticed that it remained in the zero-result videos; one child explained a rejection by saying that only one side of the mirror had been wiped. Acceptance of the RVC descriptions in zero-result events was otherwise low for every pair (children: 0%–38%; adults: 0%).</w:t>
+        <w:t xml:space="preserve"> “rinse” a mirror) behaved differently from the other pairs: Both V1s were accepted in all zero-result trials, and children also accepted the RVC descriptions of the zero-result videos in 50% (</w:t>
+      </w:r>
+      <w:r>
+        <w:rPr>
+          <w:i/>
+        </w:rPr>
+        <w:t xml:space="preserve">cā-gānjìng</w:t>
+      </w:r>
+      <w:r>
+        <w:rPr/>
+        <w:t xml:space="preserve">) and 75% (</w:t>
+      </w:r>
+      <w:r>
+        <w:rPr>
+          <w:i/>
+        </w:rPr>
+        <w:t xml:space="preserve">chōng-gānjìng</w:t>
+      </w:r>
+      <w:r>
+        <w:rPr/>
+        <w:t xml:space="preserve">) of trials, as did one of the five adults who judged </w:t>
+      </w:r>
+      <w:r>
+        <w:rPr>
+          <w:i/>
+        </w:rPr>
+        <w:t xml:space="preserve">cā-gānjìng</w:t>
+      </w:r>
+      <w:r>
+        <w:rPr/>
+        <w:t xml:space="preserve">. In the videos of this pair, the stain on the mirror was a small red spot in one corner and was not very conspicuous, so that whether the mirror had become clean was difficult to see; one child explained a rejection by saying that only one side of the mirror had been wiped. Acceptance of the RVC descriptions in zero-result events was otherwise low for every pair (children: 0%–38%; adults: 0%).</w:t>
       </w:r>
     </w:p>
     <w:p>
@@ -7613,6 +7618,13 @@
       </w:r>
     </w:p>
     <w:p>
+      <w:pPr/>
+      <w:r>
+        <w:rPr/>
+        <w:t xml:space="preserve">The exception to children’s rejection of RVC descriptions of zero-result events was Pair 9, in which the stain on the mirror was small and inconspicuous. In this pair, children accepted the RVC descriptions of zero-result videos in more than half of the trials, whereas adults rarely did. This pattern is consistent with the finding that endstate salience affects Mandarin-speaking children’s judgments of RVCs: Children aged 3 to 7 years rejected RVCs for events without a change of state more often when the change would have been a salient change of shape than when it would have been a less salient change of location (Song &amp; Haryu, 2025). When the end state is hard to see, children may thus be less certain that the result named by V2 is absent, and accept an RVC that they would reject for an event with a clearly visible absence of the result. Pair 9 therefore does not indicate that children treat RVCs as compatible with an unattained result; it indicates that their judgments depend on how clearly the event shows that the result was not attained, a factor that the other pairs, in which the absence of the result was easy to see, held largely constant.</w:t>
+      </w:r>
+    </w:p>
+    <w:p>
       <w:pPr>
         <w:pStyle w:val="Heading2"/>
         <w:rPr>
@@ -7800,7 +7812,7 @@
       </w:r>
       <w:r>
         <w:rPr/>
-        <w:t xml:space="preserve"> “kick” with a bottle and with a door, would test this directly. Third, likelihood, typicality, and RVC conventionality covary across the retained pairs. Separating them would require pairs in which they diverge, as in the excluded Pair 7, with the two ratings collected from different raters; in the present study, the same raters always gave the likelihood ratings first. Fourth, with eight pairs and with stronger- and weaker-association V1s judged by different participants, each association effect rests on few items and small groups, and item-level estimates are descriptive; in addition, the ratings were collected and two pairs excluded after an initial analysis of the same children’s data. The eight-pair results agreed with the 10-pair analyses, but the association effect needs to be replicated with a new sample of children, and the comparison of the effect between children and adults requires larger samples. Fifth, the ratings describe expressions rather than videos, and the videos did not always elicit the intended V1; for Pairs 4 and 10, the rating items differed slightly in wording from the experimental items; and in Pair 9, the stain on the mirror was small, so the zero-result videos may not have shown clearly that the mirror remained unclean. Sixth, the production data were coded with item-specific criteria that will be checked by a second coder. </w:t>
+        <w:t xml:space="preserve"> “kick” with a bottle and with a door, would test this directly. Third, likelihood, typicality, and RVC conventionality covary across the retained pairs. Separating them would require pairs in which they diverge, as in the excluded Pair 7, with the two ratings collected from different raters; in the present study, the same raters always gave the likelihood ratings first. Fourth, with eight pairs and with stronger- and weaker-association V1s judged by different participants, each association effect rests on few items and small groups, and item-level estimates are descriptive; in addition, the ratings were collected and two pairs excluded after an initial analysis of the same children’s data. The eight-pair results agreed with the 10-pair analyses, but the association effect needs to be replicated with a new sample of children, and the comparison of the effect between children and adults requires larger samples. Fifth, the ratings describe expressions rather than videos, and the videos did not always elicit the intended V1; in Pair 9, the stain on the mirror was small, so the zero-result videos may not have shown clearly that the mirror remained unclean. More generally, the target results differ in kind and possibly in salience: Some involve a change of shape or integrity (a lychee coming open, paper tearing apart, a walnut cracking open, a finger bending), others a change of position or posture (a stool overturning, a bottle falling over), and others a change of surface state or light (a mirror becoming clean, a candle going out). Because endstate salience affects children’s judgments of RVCs (Song &amp; Haryu, 2025), such differences may contribute to variation across pairs, although they are matched within pairs, where the two actions share the object and the target result, and therefore cannot account for the association effect. Sixth, the production data were coded with item-specific criteria that will be checked by a second coder. </w:t>
       </w:r>
       <w:r>
         <w:rPr>
@@ -8447,6 +8459,25 @@
       </w:r>
       <w:r>
         <w:t>. R Foundation for Statistical Computing. https://www.R-project.org/</w:t>
+      </w:r>
+    </w:p>
+    <w:p>
+      <w:pPr>
+        <w:pStyle w:val="Reference"/>
+      </w:pPr>
+      <w:r>
+        <w:rPr/>
+        <w:t xml:space="preserve">Song, Z. T., &amp; Haryu, E. (2025, August). </w:t>
+      </w:r>
+      <w:r>
+        <w:rPr>
+          <w:i/>
+        </w:rPr>
+        <w:t xml:space="preserve">“The end matters”: Endstate salience in change-of-state events affects Mandarin-speaking children’s acceptance of verbal packaging patterns of action and result</w:t>
+      </w:r>
+      <w:r>
+        <w:rPr/>
+        <w:t xml:space="preserve"> [Poster presentation]. European Conference on Developmental Psychology (ECDP 2025), Prague, Czech Republic.</w:t>
       </w:r>
     </w:p>
     <w:p>
@@ -9803,7 +9834,7 @@
             <w:r/>
             <w:r>
               <w:rPr/>
-              <w:t xml:space="preserve">0.55</w:t>
+              <w:t xml:space="preserve">0.75</w:t>
             </w:r>
           </w:p>
         </w:tc>

</xml_diff>

<commit_message>
R15: task instructions in both procedures, discussion of elicitation question and judgment framing with Song & Haryu posters
Co-Authored-By: Claude Opus 5.5 <noreply@anthropic.com>
Claude-Session: https://claude.ai/code/session_01Q96WePso3R7jviE8KBARip
</commit_message>
<xml_diff>
--- a/drafts/Manuscript_R15_full_draft.docx
+++ b/drafts/Manuscript_R15_full_draft.docx
@@ -5296,8 +5296,58 @@
       </w:r>
     </w:p>
     <w:p>
-      <w:r>
-        <w:t>Children were tested individually in a quiet room in their kindergarten. After each video, they heard the question and answered orally, and an experimenter recorded the response. If a child reported not having seen the video clearly or did not answer, the video was played once more. Adults were tested online in Gorilla (Anwyl-Irvine et al., 2020); they received oral instructions from an experimenter and selected their answers themselves. Each session began with one practice trial. Acceptance was coded 1 and rejection 0.</w:t>
+      <w:r/>
+      <w:r>
+        <w:rPr/>
+        <w:t xml:space="preserve">Children were tested individually in a quiet room in their kindergarten. They were told that they would watch short videos and act as a “little teacher” (</w:t>
+      </w:r>
+      <w:r>
+        <w:rPr>
+          <w:i/>
+        </w:rPr>
+        <w:t xml:space="preserve">xiǎo lǎoshī</w:t>
+      </w:r>
+      <w:r>
+        <w:rPr/>
+        <w:t xml:space="preserve">), judging whether what the experimenter said about each video was right or wrong (</w:t>
+      </w:r>
+      <w:r>
+        <w:rPr>
+          <w:i/>
+        </w:rPr>
+        <w:t xml:space="preserve">duì háishi bú duì</w:t>
+      </w:r>
+      <w:r>
+        <w:rPr/>
+        <w:t xml:space="preserve">). Before the test trials, they were familiarized with three of the objects (a candle, a lychee, and a walnut). After each video, they heard the test question and answered orally, </w:t>
+      </w:r>
+      <w:r>
+        <w:rPr>
+          <w:highlight w:val="yellow"/>
+        </w:rPr>
+        <w:t xml:space="preserve">[请核对：儿童指导语示例为陈述句加“我说得对还是不对啊？”（“这个人剥了一颗荔枝”），而数据中的测试句为“他剥了荔枝吗？”；请确认儿童实际听到的句式]</w:t>
+      </w:r>
+      <w:r>
+        <w:rPr/>
+        <w:t xml:space="preserve"> and an experimenter recorded the response. If a child reported not having seen the video clearly or did not answer, the video was played once more. Adults were tested online in Gorilla (Anwyl-Irvine et al., 2020); </w:t>
+      </w:r>
+      <w:r>
+        <w:rPr/>
+        <w:t xml:space="preserve">they were told that the experimenter would say what they had seen in each video and that they should judge whether this was right or wrong, and they selected their answers themselves. The practice trial used a filler video (</w:t>
+      </w:r>
+      <w:r>
+        <w:rPr>
+          <w:i/>
+        </w:rPr>
+        <w:t xml:space="preserve">Zhège nǚhái pā-xià le ma?</w:t>
+      </w:r>
+      <w:r>
+        <w:rPr/>
+        <w:t xml:space="preserve"> “Did this girl lie down?”).</w:t>
+      </w:r>
+      <w:r>
+        <w:rPr/>
+        <w:t xml:space="preserve"> Each session began with one practice trial. Acceptance was coded 1 and rejection 0.</w:t>
       </w:r>
     </w:p>
     <w:p>
@@ -6111,13 +6161,46 @@
     </w:p>
     <w:p>
       <w:r>
-        <w:t xml:space="preserve">The 40 critical videos were divided into four lists. Each list contained either the 10 stronger-association or the 10 weaker-association actions, five in their full-result and five in their zero-result version, together with the eight filler videos (one practice and seven test trials). Four further lists presented the same videos in reverse order, yielding eight lists. Participants were randomly assigned to lists, watched each video, and were asked to describe what happened. </w:t>
+        <w:t xml:space="preserve">The 40 critical videos were divided into four lists. Each list contained either the 10 stronger-association or the 10 weaker-association actions, five in their full-result and five in their zero-result version, together with the eight filler videos (one practice and seven test trials). Four further lists presented the same videos in reverse order, yielding eight lists. Participants were randomly assigned to lists, </w:t>
+      </w:r>
+      <w:r>
+        <w:rPr/>
+        <w:t xml:space="preserve">watched each video, and described it. Children were told that they would play a question-and-answer game. Before the test trials, they were familiarized with three of the objects (a candle, a lychee, and a walnut). After each video, the experimenter asked, </w:t>
+      </w:r>
+      <w:r>
+        <w:rPr>
+          <w:i/>
+        </w:rPr>
+        <w:t xml:space="preserve">Nǐ kàn-dào le shénme ya?</w:t>
+      </w:r>
+      <w:r>
+        <w:rPr/>
+        <w:t xml:space="preserve"> “What did you see?” If a child responded with a verb, no further question was asked. If a child named only an object, the experimenter asked, </w:t>
+      </w:r>
+      <w:r>
+        <w:rPr>
+          <w:i/>
+        </w:rPr>
+        <w:t xml:space="preserve">Nà zhège rén zài zuò shénme ya?</w:t>
+      </w:r>
+      <w:r>
+        <w:rPr/>
+        <w:t xml:space="preserve"> “Then what is this person doing?” If a child said that they did not know, the video was played again and the first question repeated; trials on which the child still did not know were not analyzed. Adults were told that they would watch short videos of everyday activities and should describe in one sentence what they saw in each video. The experimenter demonstrated the task with a filler video (</w:t>
+      </w:r>
+      <w:r>
+        <w:rPr>
+          <w:i/>
+        </w:rPr>
+        <w:t xml:space="preserve">Yí ge nǚhái pā-xià le</w:t>
+      </w:r>
+      <w:r>
+        <w:rPr/>
+        <w:t xml:space="preserve"> “A girl lay down”).</w:t>
       </w:r>
       <w:r>
         <w:rPr>
           <w:highlight w:val="yellow"/>
         </w:rPr>
-        <w:t>[指导语原文]</w:t>
       </w:r>
       <w:r>
         <w:t xml:space="preserve"> Children responded orally, and an experimenter transcribed their responses; adults typed their descriptions online. Because response modality differed between children and adults, child–adult differences are interpreted with caution.</w:t>
@@ -7787,7 +7870,44 @@
       <w:pPr/>
       <w:r>
         <w:rPr/>
-        <w:t xml:space="preserve">The two experiments also present an asymmetry at the group level. In production, children described most zero-result events with action-only responses, that is, with the kind of V1 description they rejected in about 40% of comprehension trials. If children judged V1 descriptions of failed attempts to be false because the V1 entails the result, they should avoid such descriptions in production as well. That they produced them freely suggests that their rejections in comprehension do not reflect a lexical entailment but how they evaluate a description supplied to them, for example as leaving an expected result unaddressed or as describing a poor instance of the action. This interpretation is tentative, because comprehension and production were tested in independent samples and the tasks differ in their demands: An open-ended description task allows a speaker to describe the action without committing to the result, whereas a yes–no question requires a decision about a description that may be taken to bear on the result. A within-participant comparison of comprehension and production would test the interpretation directly.</w:t>
+        <w:t xml:space="preserve">The elicitation questions bear on these differences. Children were first asked </w:t>
+      </w:r>
+      <w:r>
+        <w:rPr>
+          <w:i/>
+        </w:rPr>
+        <w:t xml:space="preserve">Nǐ kàn-dào le shénme ya?</w:t>
+      </w:r>
+      <w:r>
+        <w:rPr/>
+        <w:t xml:space="preserve"> “What did you see?” and, if they named only an object, </w:t>
+      </w:r>
+      <w:r>
+        <w:rPr>
+          <w:i/>
+        </w:rPr>
+        <w:t xml:space="preserve">Nà zhège rén zài zuò shénme ya?</w:t>
+      </w:r>
+      <w:r>
+        <w:rPr/>
+        <w:t xml:space="preserve"> “Then what is this person doing?” The first question does not direct attention to what happened to the object, and the second, with the progressive marker </w:t>
+      </w:r>
+      <w:r>
+        <w:rPr>
+          <w:i/>
+        </w:rPr>
+        <w:t xml:space="preserve">zài</w:t>
+      </w:r>
+      <w:r>
+        <w:rPr/>
+        <w:t xml:space="preserve">, asks about the ongoing activity, which an action-only description answers fully. Adults were asked to describe in one sentence what they saw. When Mandarin-speaking children were instead asked to describe what the agent did to the object, they produced RVCs for most events with a change of state and action verbs for most events without one, much as adults did (Song &amp; Haryu, 2026). The low rate of RVCs in children’s descriptions of full-result events in the present study therefore probably reflects in part the open prompt and the follow-up question rather than difficulty in forming RVCs. This strengthens the conclusion that children’s RVC use in open-ended description depends on which information they choose to express, and it implies that comparisons of RVC frequencies across studies need to take the elicitation question into account. Song and Haryu (2026) also found that, in events without a change of state, children produced more action verbs when the expected end state was salient, which suggests that endstate salience may also shape whether children mention an unattained result.</w:t>
+      </w:r>
+    </w:p>
+    <w:p>
+      <w:pPr/>
+      <w:r>
+        <w:rPr/>
+        <w:t xml:space="preserve">The two experiments also present an asymmetry at the group level. In production, children described most zero-result events with action-only responses, that is, with the kind of V1 description they rejected in about 40% of comprehension trials. If children judged V1 descriptions of failed attempts to be false because the V1 entails the result, they should avoid such descriptions in production as well. That they produced them freely suggests that their rejections in comprehension do not reflect a lexical entailment but how they evaluate a description supplied to them, for example as leaving an expected result unaddressed or as describing a poor instance of the action. This interpretation is tentative, because comprehension and production were tested in independent samples and the tasks differ in their demands. In the comprehension task, children were asked to act as a “little teacher” and judge whether what the experimenter said about each video was right or wrong. This framing asks them to evaluate a description as a report of the event, and a report that names the action but says nothing about an expected and visibly unattained result may seem wrong to a child even if it is literally true. In the production task, by contrast, children were asked only what they had seen, which an action-only description answers. A within-participant comparison of comprehension and production would test the interpretation directly.</w:t>
       </w:r>
     </w:p>
     <w:p>
@@ -7812,7 +7932,17 @@
       </w:r>
       <w:r>
         <w:rPr/>
-        <w:t xml:space="preserve"> “kick” with a bottle and with a door, would test this directly. Third, likelihood, typicality, and RVC conventionality covary across the retained pairs. Separating them would require pairs in which they diverge, as in the excluded Pair 7, with the two ratings collected from different raters; in the present study, the same raters always gave the likelihood ratings first. Fourth, with eight pairs and with stronger- and weaker-association V1s judged by different participants, each association effect rests on few items and small groups, and item-level estimates are descriptive; in addition, the ratings were collected and two pairs excluded after an initial analysis of the same children’s data. The eight-pair results agreed with the 10-pair analyses, but the association effect needs to be replicated with a new sample of children, and the comparison of the effect between children and adults requires larger samples. Fifth, the ratings describe expressions rather than videos, and the videos did not always elicit the intended V1; in Pair 9, the stain on the mirror was small, so the zero-result videos may not have shown clearly that the mirror remained unclean. More generally, the target results differ in kind and possibly in salience: Some involve a change of shape or integrity (a lychee coming open, paper tearing apart, a walnut cracking open, a finger bending), others a change of position or posture (a stool overturning, a bottle falling over), and others a change of surface state or light (a mirror becoming clean, a candle going out). Because endstate salience affects children’s judgments of RVCs (Song &amp; Haryu, 2025), such differences may contribute to variation across pairs, although they are matched within pairs, where the two actions share the object and the target result, and therefore cannot account for the association effect. Sixth, the production data were coded with item-specific criteria that will be checked by a second coder. </w:t>
+        <w:t xml:space="preserve"> “kick” with a bottle and with a door, would test this directly. Third, likelihood, typicality, and RVC conventionality covary across the retained pairs. Separating them would require pairs in which they diverge, as in the excluded Pair 7, with the two ratings collected from different raters; in the present study, the same raters always gave the likelihood ratings first. Fourth, with eight pairs and with stronger- and weaker-association V1s judged by different participants, each association effect rests on few items and small groups, and item-level estimates are descriptive; in addition, the ratings were collected and two pairs excluded after an initial analysis of the same children’s data. The eight-pair results agreed with the 10-pair analyses, but the association effect needs to be replicated with a new sample of children, and the comparison of the effect between children and adults requires larger samples. Fifth, the ratings describe expressions rather than videos, and the videos did not always elicit the intended V1; in Pair 9, the stain on the mirror was small, so the zero-result videos may not have shown clearly that the mirror remained unclean. More generally, the target results differ in kind and possibly in salience: Some involve a change of shape or integrity (a lychee coming open, paper tearing apart, a walnut cracking open, a finger bending), others a change of position or posture (a stool overturning, a bottle falling over), and others a change of surface state or light (a mirror becoming clean, a candle going out). Because endstate salience affects children’s judgments of RVCs (Song &amp; Haryu, 2025), such differences may contribute to variation across pairs, although they are matched within pairs, where the two actions share the object and the target result, and therefore cannot account for the association effect. Sixth, in the production task, the follow-up question </w:t>
+      </w:r>
+      <w:r>
+        <w:rPr>
+          <w:i/>
+        </w:rPr>
+        <w:t xml:space="preserve">zài zuò shénme</w:t>
+      </w:r>
+      <w:r>
+        <w:rPr/>
+        <w:t xml:space="preserve"> “is doing what” may have favored action-only descriptions, and responses given after this question are not distinguished from first responses in the present coding. Seventh, the production data were coded with item-specific criteria that will be checked by a second coder. </w:t>
       </w:r>
       <w:r>
         <w:rPr>
@@ -8478,6 +8608,25 @@
       <w:r>
         <w:rPr/>
         <w:t xml:space="preserve"> [Poster presentation]. European Conference on Developmental Psychology (ECDP 2025), Prague, Czech Republic.</w:t>
+      </w:r>
+    </w:p>
+    <w:p>
+      <w:pPr>
+        <w:pStyle w:val="Reference"/>
+      </w:pPr>
+      <w:r>
+        <w:rPr/>
+        <w:t xml:space="preserve">Song, Z. T., &amp; Haryu, E. (2026). </w:t>
+      </w:r>
+      <w:r>
+        <w:rPr>
+          <w:i/>
+        </w:rPr>
+        <w:t xml:space="preserve">Mandarin-speaking children can correctly produce change-of-state verbs: Limited influence of event state structure</w:t>
+      </w:r>
+      <w:r>
+        <w:rPr/>
+        <w:t xml:space="preserve"> [Poster presentation]. APS Global Psychological Science Summit.</w:t>
       </w:r>
     </w:p>
     <w:p>

</xml_diff>

<commit_message>
R15: same instructions for children and adults in Exp1; Pair 9 as perceptibility; restrained Song & Haryu citations; within-pair design point; result-type limitation
Co-Authored-By: Claude Opus 5.5 <noreply@anthropic.com>
Claude-Session: https://claude.ai/code/session_01Q96WePso3R7jviE8KBARip
</commit_message>
<xml_diff>
--- a/drafts/Manuscript_R15_full_draft.docx
+++ b/drafts/Manuscript_R15_full_draft.docx
@@ -5299,33 +5299,47 @@
       <w:r/>
       <w:r>
         <w:rPr/>
-        <w:t xml:space="preserve">Children were tested individually in a quiet room in their kindergarten. They were told that they would watch short videos and act as a “little teacher” (</w:t>
-      </w:r>
-      <w:r>
-        <w:rPr>
-          <w:i/>
-        </w:rPr>
-        <w:t xml:space="preserve">xiǎo lǎoshī</w:t>
-      </w:r>
-      <w:r>
-        <w:rPr/>
-        <w:t xml:space="preserve">), judging whether what the experimenter said about each video was right or wrong (</w:t>
-      </w:r>
-      <w:r>
-        <w:rPr>
-          <w:i/>
-        </w:rPr>
-        <w:t xml:space="preserve">duì háishi bú duì</w:t>
-      </w:r>
-      <w:r>
-        <w:rPr/>
-        <w:t xml:space="preserve">). Before the test trials, they were familiarized with three of the objects (a candle, a lychee, and a walnut). After each video, they heard the test question and answered orally, </w:t>
-      </w:r>
-      <w:r>
-        <w:rPr>
-          <w:highlight w:val="yellow"/>
-        </w:rPr>
-        <w:t xml:space="preserve">[请核对：儿童指导语示例为陈述句加“我说得对还是不对啊？”（“这个人剥了一颗荔枝”），而数据中的测试句为“他剥了荔枝吗？”；请确认儿童实际听到的句式]</w:t>
+        <w:t xml:space="preserve">Children and adults received the same instructions. They were told that they would watch short videos of everyday activities, that after each video the experimenter would say what they had seen, and that they should judge whether this was right or wrong. On the practice trial, which used a filler video, the experimenter said, </w:t>
+      </w:r>
+      <w:r>
+        <w:rPr>
+          <w:i/>
+        </w:rPr>
+        <w:t xml:space="preserve">Wǒ kàn-dào zài zhège shìpín lǐ, zhège nǚhái pā-xià le</w:t>
+      </w:r>
+      <w:r>
+        <w:rPr/>
+        <w:t xml:space="preserve"> “I saw in this video that this girl lay down,” asked whether this was right or wrong, and then asked, </w:t>
+      </w:r>
+      <w:r>
+        <w:rPr>
+          <w:i/>
+        </w:rPr>
+        <w:t xml:space="preserve">Zhège nǚhái pā-xià le ma?</w:t>
+      </w:r>
+      <w:r>
+        <w:rPr/>
+        <w:t xml:space="preserve"> “Did this girl lie down?” Participants answered in their own words, typically by repeating or negating the verb (e.g., </w:t>
+      </w:r>
+      <w:r>
+        <w:rPr>
+          <w:i/>
+        </w:rPr>
+        <w:t xml:space="preserve">pā-xià le</w:t>
+      </w:r>
+      <w:r>
+        <w:rPr/>
+        <w:t xml:space="preserve"> “lay down”; </w:t>
+      </w:r>
+      <w:r>
+        <w:rPr>
+          <w:i/>
+        </w:rPr>
+        <w:t xml:space="preserve">méi pā-xià</w:t>
+      </w:r>
+      <w:r>
+        <w:rPr/>
+        <w:t xml:space="preserve"> “did not lie down”), and their answers were coded as acceptance or rejection. Children were tested individually in a quiet room in their kindergarten. After each video, they heard the test question and answered orally,</w:t>
       </w:r>
       <w:r>
         <w:rPr/>
@@ -5333,17 +5347,7 @@
       </w:r>
       <w:r>
         <w:rPr/>
-        <w:t xml:space="preserve">they were told that the experimenter would say what they had seen in each video and that they should judge whether this was right or wrong, and they selected their answers themselves. The practice trial used a filler video (</w:t>
-      </w:r>
-      <w:r>
-        <w:rPr>
-          <w:i/>
-        </w:rPr>
-        <w:t xml:space="preserve">Zhège nǚhái pā-xià le ma?</w:t>
-      </w:r>
-      <w:r>
-        <w:rPr/>
-        <w:t xml:space="preserve"> “Did this girl lie down?”).</w:t>
+        <w:t xml:space="preserve">they received the instructions orally from an experimenter and selected their answers themselves.</w:t>
       </w:r>
       <w:r>
         <w:rPr/>
@@ -7704,7 +7708,7 @@
       <w:pPr/>
       <w:r>
         <w:rPr/>
-        <w:t xml:space="preserve">The exception to children’s rejection of RVC descriptions of zero-result events was Pair 9, in which the stain on the mirror was small and inconspicuous. In this pair, children accepted the RVC descriptions of zero-result videos in more than half of the trials, whereas adults rarely did. This pattern is consistent with the finding that endstate salience affects Mandarin-speaking children’s judgments of RVCs: Children aged 3 to 7 years rejected RVCs for events without a change of state more often when the change would have been a salient change of shape than when it would have been a less salient change of location (Song &amp; Haryu, 2025). When the end state is hard to see, children may thus be less certain that the result named by V2 is absent, and accept an RVC that they would reject for an event with a clearly visible absence of the result. Pair 9 therefore does not indicate that children treat RVCs as compatible with an unattained result; it indicates that their judgments depend on how clearly the event shows that the result was not attained, a factor that the other pairs, in which the absence of the result was easy to see, held largely constant.</w:t>
+        <w:t xml:space="preserve">The exception to children’s rejection of RVC descriptions of zero-result events was Pair 9. In the videos of this pair, the stain on the mirror was a small spot in one corner, so the zero-result videos may not have shown clearly that the mirror had not become clean. Children’s acceptance of the RVC descriptions of these videos therefore probably reflects the perceptibility of the result in these particular videos, that is, whether its absence could be seen, rather than an interpretation of the RVC as compatible with an unattained result. In the other pairs, in which the absence of the result was easy to see, children rarely accepted RVC descriptions of zero-result events.</w:t>
       </w:r>
     </w:p>
     <w:p>
@@ -7724,7 +7728,7 @@
     <w:p>
       <w:r>
         <w:rPr/>
-        <w:t xml:space="preserve">Children and adults rejected V1 descriptions of zero-result events more often when the V1 named an action strongly associated with the target result. Because the object and the target result were constant within pairs, this association effect cannot be attributed to differences between objects or results, which was not possible in previous studies in which each V1 was presented with a different object and result (Chen, 2017). The effect was carried by most pairs rather than by one or two, and it was found with all 10 pairs and with each pair left out in turn. For both children and adults, then, what a V1 description conveys about a result depends on how the named action relates to that result. In adults, this is consistent with the cline in the acceptability of result cancellation across verbs (Chen, 2018) and with evidence that comprehenders’ expectations about events depend on the combination of a verb with its arguments (Bicknell et al., 2010; McRae &amp; Matsuki, 2009). In children, it shows that the variation among V1s that Chen (2017) attributed to the strength of the state-change implicature can be found when the event is held constant and only the action varies.</w:t>
+        <w:t xml:space="preserve">Children and adults rejected V1 descriptions of zero-result events more often when the V1 named an action strongly associated with the target result. Because the object and the target result were constant within pairs, this association effect cannot be attributed to differences between objects or results, which was not possible in previous studies in which each V1 was presented with a different object and result (Chen, 2017). Previous studies have also compared events across result types: Song and Haryu (2025), for example, compared shape-change and location-change events, assuming that they differ in endstate salience. When result types are compared, the type of result goes together with many other properties of the events. The present study instead held the object and the result constant within pairs, so that only the action varied, and measured the manipulated dimension independently, with adult ratings of result likelihood and action typicality, cross-checked against corpus frequencies of the corresponding RVCs. The effect was carried by most pairs rather than by one or two, and it was found with all 10 pairs and with each pair left out in turn. For both children and adults, then, what a V1 description conveys about a result depends on how the named action relates to that result. In adults, this is consistent with the cline in the acceptability of result cancellation across verbs (Chen, 2018) and with evidence that comprehenders’ expectations about events depend on the combination of a verb with its arguments (Bicknell et al., 2010; McRae &amp; Matsuki, 2009). In children, it shows that the variation among V1s that Chen (2017) attributed to the strength of the state-change implicature can be found when the event is held constant and only the action varies.</w:t>
       </w:r>
     </w:p>
     <w:p>
@@ -7900,14 +7904,14 @@
       </w:r>
       <w:r>
         <w:rPr/>
-        <w:t xml:space="preserve">, asks about the ongoing activity, which an action-only description answers fully. Adults were asked to describe in one sentence what they saw. When Mandarin-speaking children were instead asked to describe what the agent did to the object, they produced RVCs for most events with a change of state and action verbs for most events without one, much as adults did (Song &amp; Haryu, 2026). The low rate of RVCs in children’s descriptions of full-result events in the present study therefore probably reflects in part the open prompt and the follow-up question rather than difficulty in forming RVCs. This strengthens the conclusion that children’s RVC use in open-ended description depends on which information they choose to express, and it implies that comparisons of RVC frequencies across studies need to take the elicitation question into account. Song and Haryu (2026) also found that, in events without a change of state, children produced more action verbs when the expected end state was salient, which suggests that endstate salience may also shape whether children mention an unattained result.</w:t>
+        <w:t xml:space="preserve">, asks about the ongoing activity, which an action-only description answers fully. Adults were asked to describe in one sentence what they saw. Song and Haryu (2026) asked Mandarin-speaking children to describe what the agent did to the object and reported that children, like adults, produced RVCs for most events with a change of state and action verbs for most events without one. The low rate of RVCs in children’s descriptions of full-result events in the present study therefore probably reflects in part the open prompt and the follow-up question rather than difficulty in forming RVCs. This strengthens the conclusion that children’s RVC use in open-ended description depends on which information they choose to express, and it implies that comparisons of RVC frequencies across studies need to take the elicitation question into account.</w:t>
       </w:r>
     </w:p>
     <w:p>
       <w:pPr/>
       <w:r>
         <w:rPr/>
-        <w:t xml:space="preserve">The two experiments also present an asymmetry at the group level. In production, children described most zero-result events with action-only responses, that is, with the kind of V1 description they rejected in about 40% of comprehension trials. If children judged V1 descriptions of failed attempts to be false because the V1 entails the result, they should avoid such descriptions in production as well. That they produced them freely suggests that their rejections in comprehension do not reflect a lexical entailment but how they evaluate a description supplied to them, for example as leaving an expected result unaddressed or as describing a poor instance of the action. This interpretation is tentative, because comprehension and production were tested in independent samples and the tasks differ in their demands. In the comprehension task, children were asked to act as a “little teacher” and judge whether what the experimenter said about each video was right or wrong. This framing asks them to evaluate a description as a report of the event, and a report that names the action but says nothing about an expected and visibly unattained result may seem wrong to a child even if it is literally true. In the production task, by contrast, children were asked only what they had seen, which an action-only description answers. A within-participant comparison of comprehension and production would test the interpretation directly.</w:t>
+        <w:t xml:space="preserve">The two experiments also present an asymmetry at the group level. In production, children described most zero-result events with action-only responses, that is, with the kind of V1 description they rejected in about 40% of comprehension trials. If children judged V1 descriptions of failed attempts to be false because the V1 entails the result, they should avoid such descriptions in production as well. That they produced them freely suggests that their rejections in comprehension do not reflect a lexical entailment but how they evaluate a description supplied to them, for example as leaving an expected result unaddressed or as describing a poor instance of the action. This interpretation is tentative, because comprehension and production were tested in independent samples and the tasks differ in their demands. In the comprehension task, participants were told that the experimenter would say what they had seen in each video and were asked to judge whether this was right or wrong. This framing asks them to evaluate a description as a report of the event, and a report that names the action but says nothing about an expected and visibly unattained result may seem wrong to a child even if it is literally true. In the production task, by contrast, children were asked only what they had seen, which an action-only description answers. A within-participant comparison of comprehension and production would test the interpretation directly.</w:t>
       </w:r>
     </w:p>
     <w:p>
@@ -7932,7 +7936,7 @@
       </w:r>
       <w:r>
         <w:rPr/>
-        <w:t xml:space="preserve"> “kick” with a bottle and with a door, would test this directly. Third, likelihood, typicality, and RVC conventionality covary across the retained pairs. Separating them would require pairs in which they diverge, as in the excluded Pair 7, with the two ratings collected from different raters; in the present study, the same raters always gave the likelihood ratings first. Fourth, with eight pairs and with stronger- and weaker-association V1s judged by different participants, each association effect rests on few items and small groups, and item-level estimates are descriptive; in addition, the ratings were collected and two pairs excluded after an initial analysis of the same children’s data. The eight-pair results agreed with the 10-pair analyses, but the association effect needs to be replicated with a new sample of children, and the comparison of the effect between children and adults requires larger samples. Fifth, the ratings describe expressions rather than videos, and the videos did not always elicit the intended V1; in Pair 9, the stain on the mirror was small, so the zero-result videos may not have shown clearly that the mirror remained unclean. More generally, the target results differ in kind and possibly in salience: Some involve a change of shape or integrity (a lychee coming open, paper tearing apart, a walnut cracking open, a finger bending), others a change of position or posture (a stool overturning, a bottle falling over), and others a change of surface state or light (a mirror becoming clean, a candle going out). Because endstate salience affects children’s judgments of RVCs (Song &amp; Haryu, 2025), such differences may contribute to variation across pairs, although they are matched within pairs, where the two actions share the object and the target result, and therefore cannot account for the association effect. Sixth, in the production task, the follow-up question </w:t>
+        <w:t xml:space="preserve"> “kick” with a bottle and with a door, would test this directly. Third, likelihood, typicality, and RVC conventionality covary across the retained pairs. Separating them would require pairs in which they diverge, as in the excluded Pair 7, with the two ratings collected from different raters; in the present study, the same raters always gave the likelihood ratings first. Fourth, with eight pairs and with stronger- and weaker-association V1s judged by different participants, each association effect rests on few items and small groups, and item-level estimates are descriptive; in addition, the ratings were collected and two pairs excluded after an initial analysis of the same children’s data. The eight-pair results agreed with the 10-pair analyses, but the association effect needs to be replicated with a new sample of children, and the comparison of the effect between children and adults requires larger samples. Fifth, the ratings describe expressions rather than videos, and the videos did not always elicit the intended V1; in Pair 9, the stain on the mirror was small, so the zero-result videos may not have shown clearly that the mirror remained unclean. More generally, the target results differ in kind across pairs: Some involve a change of shape or integrity (a lychee coming open, paper tearing apart, a walnut cracking open, a finger bending), others a change of position or posture (a stool overturning, a bottle falling over), and others a change of surface state or light (a mirror becoming clean, a candle going out). Such differences may contribute to variation across pairs, but the comparisons of interest were made within pairs, in which both actions had the same object and the same target result. Sixth, in the production task, the follow-up question </w:t>
       </w:r>
       <w:r>
         <w:rPr>

</xml_diff>